<commit_message>
Offline map and fonts, proposal diagrams, demo flash alerts
- Offline base map (specs #8, #18): server serves map/bangladesh.pmtiles at
  /api/v1/map (range requests, MAP_DIR; npm run map:download), web app draws it
  with protomaps-leaflet (BaseMap), Bangla place names, OSM tiles only as fallback
- Inter font bundled (@fontsource); Google Fonts removed from index.html and CSP
- Technical proposal: 9 diagrams (diagrams.js: architecture, deployment, workflow,
  security, evidence, backup/DR, Gantt, two ER diagrams), new sections 4.1-4.3, 5.5;
  map wording updated; documents and decks regenerated
- Demo dataset: four historical Flash Alerts (cancelled, expired, two resolved)
- Tests: offline map route; SPA CSP without font hosts

Co-Authored-By: Claude Opus 5.5 <noreply@anthropic.com>
Claude-Session: https://claude.ai/code/session_01XAvp9W16NDv6PBNDo4DTig
</commit_message>
<xml_diff>
--- a/Final Submission Documents/04-Technical-Proposal.docx
+++ b/Final Submission Documents/04-Technical-Proposal.docx
@@ -699,7 +699,7 @@
                 <w:sz w:val="20"/>
                 <w:szCs w:val="20"/>
               </w:rPr>
-              <w:t xml:space="preserve">Architecture, integration (directory, e-mail, map tiles, antivirus), performance and availability design</w:t>
+              <w:t xml:space="preserve">Architecture, integration (directory, e-mail, offline map data, antivirus), performance and availability design</w:t>
             </w:r>
           </w:p>
         </w:tc>
@@ -2171,6 +2171,2603 @@
     </w:p>
     <w:p>
       <w:pPr>
+        <w:pStyle w:val="Heading2"/>
+        <w:keepNext/>
+        <w:spacing w:before="200" w:after="100"/>
+      </w:pPr>
+      <w:r>
+        <w:rPr>
+          <w:rFonts w:ascii="Arial" w:cs="Arial" w:eastAsia="Arial" w:hAnsi="Arial"/>
+          <w:b/>
+          <w:bCs/>
+          <w:color w:val="000000"/>
+          <w:sz w:val="22"/>
+          <w:szCs w:val="22"/>
+        </w:rPr>
+        <w:t xml:space="preserve">4.1  Incident workflow</w:t>
+      </w:r>
+    </w:p>
+    <w:p>
+      <w:pPr>
+        <w:spacing w:before="0" w:after="120"/>
+        <w:jc w:val="both"/>
+      </w:pPr>
+      <w:r>
+        <w:rPr>
+          <w:rFonts w:ascii="Arial" w:cs="Arial" w:eastAsia="Arial" w:hAnsi="Arial"/>
+          <w:sz w:val="20"/>
+          <w:szCs w:val="20"/>
+        </w:rPr>
+        <w:t xml:space="preserve">Every incident follows the workflow below (items 13, 14). The server holds the only copy of these rules: it decides which actions each officer may take on each record, so the screens only offer what the server will accept. Each step notifies the next responsible officers (item 23), is added to the incident timeline (item 12) and is recorded in the audit trail (item 24).</w:t>
+      </w:r>
+    </w:p>
+    <w:p>
+      <w:pPr>
+        <w:keepNext/>
+        <w:spacing w:before="120" w:after="60"/>
+        <w:jc w:val="center"/>
+      </w:pPr>
+      <w:r>
+        <w:drawing>
+          <wp:inline distT="0" distB="0" distL="0" distR="0">
+            <wp:extent cx="6286500" cy="4781550"/>
+            <wp:effectExtent t="0" r="0" b="0" l="0"/>
+            <wp:docPr id="1" name="" descr="" title=""/>
+            <wp:cNvGraphicFramePr>
+              <a:graphicFrameLocks xmlns:a="http://schemas.openxmlformats.org/drawingml/2006/main" noChangeAspect="1"/>
+            </wp:cNvGraphicFramePr>
+            <a:graphic xmlns:a="http://schemas.openxmlformats.org/drawingml/2006/main">
+              <a:graphicData uri="http://schemas.openxmlformats.org/drawingml/2006/picture">
+                <pic:pic xmlns:pic="http://schemas.openxmlformats.org/drawingml/2006/picture">
+                  <pic:nvPicPr>
+                    <pic:cNvPr id="0" name="" descr=""/>
+                    <pic:cNvPicPr>
+                      <a:picLocks noChangeAspect="1" noChangeArrowheads="1"/>
+                    </pic:cNvPicPr>
+                  </pic:nvPicPr>
+                  <pic:blipFill>
+                    <a:blip r:embed="rId8" cstate="none"/>
+                    <a:srcRect/>
+                    <a:stretch>
+                      <a:fillRect/>
+                    </a:stretch>
+                  </pic:blipFill>
+                  <pic:spPr bwMode="auto">
+                    <a:xfrm>
+                      <a:off x="0" y="0"/>
+                      <a:ext cx="6286500" cy="4781550"/>
+                    </a:xfrm>
+                    <a:prstGeom prst="rect">
+                      <a:avLst/>
+                    </a:prstGeom>
+                  </pic:spPr>
+                </pic:pic>
+              </a:graphicData>
+            </a:graphic>
+          </wp:inline>
+        </w:drawing>
+      </w:r>
+    </w:p>
+    <w:p>
+      <w:pPr>
+        <w:spacing w:before="0" w:after="200"/>
+        <w:jc w:val="center"/>
+      </w:pPr>
+      <w:r>
+        <w:rPr>
+          <w:rFonts w:ascii="Arial" w:cs="Arial" w:eastAsia="Arial" w:hAnsi="Arial"/>
+          <w:b/>
+          <w:bCs/>
+          <w:sz w:val="18"/>
+          <w:szCs w:val="18"/>
+        </w:rPr>
+        <w:t xml:space="preserve">Figure 1. </w:t>
+      </w:r>
+      <w:r>
+        <w:rPr>
+          <w:rFonts w:ascii="Arial" w:cs="Arial" w:eastAsia="Arial" w:hAnsi="Arial"/>
+          <w:sz w:val="18"/>
+          <w:szCs w:val="18"/>
+        </w:rPr>
+        <w:t xml:space="preserve">Incident workflow: states, who may act at each step, and who is notified (items 12, 13, 14, 23, 25)</w:t>
+      </w:r>
+    </w:p>
+    <w:p>
+      <w:pPr>
+        <w:pStyle w:val="Heading2"/>
+        <w:keepNext/>
+        <w:spacing w:before="200" w:after="100"/>
+      </w:pPr>
+      <w:r>
+        <w:rPr>
+          <w:rFonts w:ascii="Arial" w:cs="Arial" w:eastAsia="Arial" w:hAnsi="Arial"/>
+          <w:b/>
+          <w:bCs/>
+          <w:color w:val="000000"/>
+          <w:sz w:val="22"/>
+          <w:szCs w:val="22"/>
+        </w:rPr>
+        <w:t xml:space="preserve">4.2  Roles, permissions and scope</w:t>
+      </w:r>
+    </w:p>
+    <w:p>
+      <w:pPr>
+        <w:spacing w:before="0" w:after="120"/>
+        <w:jc w:val="both"/>
+      </w:pPr>
+      <w:r>
+        <w:rPr>
+          <w:rFonts w:ascii="Arial" w:cs="Arial" w:eastAsia="Arial" w:hAnsi="Arial"/>
+          <w:sz w:val="20"/>
+          <w:szCs w:val="20"/>
+        </w:rPr>
+        <w:t xml:space="preserve">Access is decided by two things: the pages and actions the user's role is permitted (item 3), and the user's scope in the organisational hierarchy (item 9). The default permissions are shown below; administrators change them in Administration › Permissions without code changes (items 46, 47), and the server enforces them on every request.</w:t>
+      </w:r>
+    </w:p>
+    <w:tbl>
+      <w:tblPr>
+        <w:tblW w:type="dxa" w:w="9906"/>
+        <w:tblBorders>
+          <w:top w:val="single" w:color="auto" w:sz="4"/>
+          <w:left w:val="single" w:color="auto" w:sz="4"/>
+          <w:bottom w:val="single" w:color="auto" w:sz="4"/>
+          <w:right w:val="single" w:color="auto" w:sz="4"/>
+          <w:insideH w:val="single" w:color="auto" w:sz="4"/>
+          <w:insideV w:val="single" w:color="auto" w:sz="4"/>
+        </w:tblBorders>
+      </w:tblPr>
+      <w:tblGrid>
+        <w:gridCol w:w="2906"/>
+        <w:gridCol w:w="1400"/>
+        <w:gridCol w:w="1400"/>
+        <w:gridCol w:w="1400"/>
+        <w:gridCol w:w="1400"/>
+        <w:gridCol w:w="1400"/>
+      </w:tblGrid>
+      <w:tr>
+        <w:trPr>
+          <w:cantSplit/>
+          <w:tblHeader/>
+        </w:trPr>
+        <w:tc>
+          <w:tcPr>
+            <w:tcW w:type="dxa" w:w="2906"/>
+            <w:tcBorders>
+              <w:top w:val="single" w:color="000000" w:sz="4"/>
+              <w:left w:val="single" w:color="000000" w:sz="4"/>
+              <w:bottom w:val="single" w:color="000000" w:sz="4"/>
+              <w:right w:val="single" w:color="000000" w:sz="4"/>
+            </w:tcBorders>
+            <w:shd w:fill="E7E6E6" w:color="auto" w:val="clear"/>
+            <w:tcMar>
+              <w:top w:type="dxa" w:w="60"/>
+              <w:left w:type="dxa" w:w="100"/>
+              <w:bottom w:type="dxa" w:w="60"/>
+              <w:right w:type="dxa" w:w="100"/>
+            </w:tcMar>
+            <w:vAlign w:val="top"/>
+          </w:tcPr>
+          <w:p>
+            <w:pPr>
+              <w:spacing w:before="0" w:after="0"/>
+            </w:pPr>
+            <w:r>
+              <w:rPr>
+                <w:rFonts w:ascii="Arial" w:cs="Arial" w:eastAsia="Arial" w:hAnsi="Arial"/>
+                <w:b/>
+                <w:bCs/>
+                <w:sz w:val="20"/>
+                <w:szCs w:val="20"/>
+              </w:rPr>
+              <w:t xml:space="preserve">Page / function</w:t>
+            </w:r>
+          </w:p>
+        </w:tc>
+        <w:tc>
+          <w:tcPr>
+            <w:tcW w:type="dxa" w:w="1400"/>
+            <w:tcBorders>
+              <w:top w:val="single" w:color="000000" w:sz="4"/>
+              <w:left w:val="single" w:color="000000" w:sz="4"/>
+              <w:bottom w:val="single" w:color="000000" w:sz="4"/>
+              <w:right w:val="single" w:color="000000" w:sz="4"/>
+            </w:tcBorders>
+            <w:shd w:fill="E7E6E6" w:color="auto" w:val="clear"/>
+            <w:tcMar>
+              <w:top w:type="dxa" w:w="60"/>
+              <w:left w:type="dxa" w:w="100"/>
+              <w:bottom w:type="dxa" w:w="60"/>
+              <w:right w:type="dxa" w:w="100"/>
+            </w:tcMar>
+            <w:vAlign w:val="top"/>
+          </w:tcPr>
+          <w:p>
+            <w:pPr>
+              <w:spacing w:before="0" w:after="0"/>
+            </w:pPr>
+            <w:r>
+              <w:rPr>
+                <w:rFonts w:ascii="Arial" w:cs="Arial" w:eastAsia="Arial" w:hAnsi="Arial"/>
+                <w:b/>
+                <w:bCs/>
+                <w:sz w:val="20"/>
+                <w:szCs w:val="20"/>
+              </w:rPr>
+              <w:t xml:space="preserve">HQ Administrator</w:t>
+            </w:r>
+          </w:p>
+        </w:tc>
+        <w:tc>
+          <w:tcPr>
+            <w:tcW w:type="dxa" w:w="1400"/>
+            <w:tcBorders>
+              <w:top w:val="single" w:color="000000" w:sz="4"/>
+              <w:left w:val="single" w:color="000000" w:sz="4"/>
+              <w:bottom w:val="single" w:color="000000" w:sz="4"/>
+              <w:right w:val="single" w:color="000000" w:sz="4"/>
+            </w:tcBorders>
+            <w:shd w:fill="E7E6E6" w:color="auto" w:val="clear"/>
+            <w:tcMar>
+              <w:top w:type="dxa" w:w="60"/>
+              <w:left w:type="dxa" w:w="100"/>
+              <w:bottom w:type="dxa" w:w="60"/>
+              <w:right w:type="dxa" w:w="100"/>
+            </w:tcMar>
+            <w:vAlign w:val="top"/>
+          </w:tcPr>
+          <w:p>
+            <w:pPr>
+              <w:spacing w:before="0" w:after="0"/>
+            </w:pPr>
+            <w:r>
+              <w:rPr>
+                <w:rFonts w:ascii="Arial" w:cs="Arial" w:eastAsia="Arial" w:hAnsi="Arial"/>
+                <w:b/>
+                <w:bCs/>
+                <w:sz w:val="20"/>
+                <w:szCs w:val="20"/>
+              </w:rPr>
+              <w:t xml:space="preserve">Sector Officer</w:t>
+            </w:r>
+          </w:p>
+        </w:tc>
+        <w:tc>
+          <w:tcPr>
+            <w:tcW w:type="dxa" w:w="1400"/>
+            <w:tcBorders>
+              <w:top w:val="single" w:color="000000" w:sz="4"/>
+              <w:left w:val="single" w:color="000000" w:sz="4"/>
+              <w:bottom w:val="single" w:color="000000" w:sz="4"/>
+              <w:right w:val="single" w:color="000000" w:sz="4"/>
+            </w:tcBorders>
+            <w:shd w:fill="E7E6E6" w:color="auto" w:val="clear"/>
+            <w:tcMar>
+              <w:top w:type="dxa" w:w="60"/>
+              <w:left w:type="dxa" w:w="100"/>
+              <w:bottom w:type="dxa" w:w="60"/>
+              <w:right w:type="dxa" w:w="100"/>
+            </w:tcMar>
+            <w:vAlign w:val="top"/>
+          </w:tcPr>
+          <w:p>
+            <w:pPr>
+              <w:spacing w:before="0" w:after="0"/>
+            </w:pPr>
+            <w:r>
+              <w:rPr>
+                <w:rFonts w:ascii="Arial" w:cs="Arial" w:eastAsia="Arial" w:hAnsi="Arial"/>
+                <w:b/>
+                <w:bCs/>
+                <w:sz w:val="20"/>
+                <w:szCs w:val="20"/>
+              </w:rPr>
+              <w:t xml:space="preserve">Battalion Operator</w:t>
+            </w:r>
+          </w:p>
+        </w:tc>
+        <w:tc>
+          <w:tcPr>
+            <w:tcW w:type="dxa" w:w="1400"/>
+            <w:tcBorders>
+              <w:top w:val="single" w:color="000000" w:sz="4"/>
+              <w:left w:val="single" w:color="000000" w:sz="4"/>
+              <w:bottom w:val="single" w:color="000000" w:sz="4"/>
+              <w:right w:val="single" w:color="000000" w:sz="4"/>
+            </w:tcBorders>
+            <w:shd w:fill="E7E6E6" w:color="auto" w:val="clear"/>
+            <w:tcMar>
+              <w:top w:type="dxa" w:w="60"/>
+              <w:left w:type="dxa" w:w="100"/>
+              <w:bottom w:type="dxa" w:w="60"/>
+              <w:right w:type="dxa" w:w="100"/>
+            </w:tcMar>
+            <w:vAlign w:val="top"/>
+          </w:tcPr>
+          <w:p>
+            <w:pPr>
+              <w:spacing w:before="0" w:after="0"/>
+            </w:pPr>
+            <w:r>
+              <w:rPr>
+                <w:rFonts w:ascii="Arial" w:cs="Arial" w:eastAsia="Arial" w:hAnsi="Arial"/>
+                <w:b/>
+                <w:bCs/>
+                <w:sz w:val="20"/>
+                <w:szCs w:val="20"/>
+              </w:rPr>
+              <w:t xml:space="preserve">Verifier / Approver</w:t>
+            </w:r>
+          </w:p>
+        </w:tc>
+        <w:tc>
+          <w:tcPr>
+            <w:tcW w:type="dxa" w:w="1400"/>
+            <w:tcBorders>
+              <w:top w:val="single" w:color="000000" w:sz="4"/>
+              <w:left w:val="single" w:color="000000" w:sz="4"/>
+              <w:bottom w:val="single" w:color="000000" w:sz="4"/>
+              <w:right w:val="single" w:color="000000" w:sz="4"/>
+            </w:tcBorders>
+            <w:shd w:fill="E7E6E6" w:color="auto" w:val="clear"/>
+            <w:tcMar>
+              <w:top w:type="dxa" w:w="60"/>
+              <w:left w:type="dxa" w:w="100"/>
+              <w:bottom w:type="dxa" w:w="60"/>
+              <w:right w:type="dxa" w:w="100"/>
+            </w:tcMar>
+            <w:vAlign w:val="top"/>
+          </w:tcPr>
+          <w:p>
+            <w:pPr>
+              <w:spacing w:before="0" w:after="0"/>
+            </w:pPr>
+            <w:r>
+              <w:rPr>
+                <w:rFonts w:ascii="Arial" w:cs="Arial" w:eastAsia="Arial" w:hAnsi="Arial"/>
+                <w:b/>
+                <w:bCs/>
+                <w:sz w:val="20"/>
+                <w:szCs w:val="20"/>
+              </w:rPr>
+              <w:t xml:space="preserve">Auditor</w:t>
+            </w:r>
+          </w:p>
+        </w:tc>
+      </w:tr>
+      <w:tr>
+        <w:trPr>
+          <w:cantSplit/>
+        </w:trPr>
+        <w:tc>
+          <w:tcPr>
+            <w:tcW w:type="dxa" w:w="2906"/>
+            <w:tcBorders>
+              <w:top w:val="single" w:color="000000" w:sz="4"/>
+              <w:left w:val="single" w:color="000000" w:sz="4"/>
+              <w:bottom w:val="single" w:color="000000" w:sz="4"/>
+              <w:right w:val="single" w:color="000000" w:sz="4"/>
+            </w:tcBorders>
+            <w:tcMar>
+              <w:top w:type="dxa" w:w="60"/>
+              <w:left w:type="dxa" w:w="100"/>
+              <w:bottom w:type="dxa" w:w="60"/>
+              <w:right w:type="dxa" w:w="100"/>
+            </w:tcMar>
+            <w:vAlign w:val="top"/>
+          </w:tcPr>
+          <w:p>
+            <w:pPr>
+              <w:spacing w:before="0" w:after="0"/>
+            </w:pPr>
+            <w:r>
+              <w:rPr>
+                <w:rFonts w:ascii="Arial" w:cs="Arial" w:eastAsia="Arial" w:hAnsi="Arial"/>
+                <w:sz w:val="20"/>
+                <w:szCs w:val="20"/>
+              </w:rPr>
+              <w:t xml:space="preserve">Dashboard</w:t>
+            </w:r>
+          </w:p>
+        </w:tc>
+        <w:tc>
+          <w:tcPr>
+            <w:tcW w:type="dxa" w:w="1400"/>
+            <w:tcBorders>
+              <w:top w:val="single" w:color="000000" w:sz="4"/>
+              <w:left w:val="single" w:color="000000" w:sz="4"/>
+              <w:bottom w:val="single" w:color="000000" w:sz="4"/>
+              <w:right w:val="single" w:color="000000" w:sz="4"/>
+            </w:tcBorders>
+            <w:tcMar>
+              <w:top w:type="dxa" w:w="60"/>
+              <w:left w:type="dxa" w:w="100"/>
+              <w:bottom w:type="dxa" w:w="60"/>
+              <w:right w:type="dxa" w:w="100"/>
+            </w:tcMar>
+            <w:vAlign w:val="top"/>
+          </w:tcPr>
+          <w:p>
+            <w:pPr>
+              <w:spacing w:before="0" w:after="0"/>
+            </w:pPr>
+            <w:r>
+              <w:rPr>
+                <w:rFonts w:ascii="Arial" w:cs="Arial" w:eastAsia="Arial" w:hAnsi="Arial"/>
+                <w:sz w:val="20"/>
+                <w:szCs w:val="20"/>
+              </w:rPr>
+              <w:t xml:space="preserve">Yes</w:t>
+            </w:r>
+          </w:p>
+        </w:tc>
+        <w:tc>
+          <w:tcPr>
+            <w:tcW w:type="dxa" w:w="1400"/>
+            <w:tcBorders>
+              <w:top w:val="single" w:color="000000" w:sz="4"/>
+              <w:left w:val="single" w:color="000000" w:sz="4"/>
+              <w:bottom w:val="single" w:color="000000" w:sz="4"/>
+              <w:right w:val="single" w:color="000000" w:sz="4"/>
+            </w:tcBorders>
+            <w:tcMar>
+              <w:top w:type="dxa" w:w="60"/>
+              <w:left w:type="dxa" w:w="100"/>
+              <w:bottom w:type="dxa" w:w="60"/>
+              <w:right w:type="dxa" w:w="100"/>
+            </w:tcMar>
+            <w:vAlign w:val="top"/>
+          </w:tcPr>
+          <w:p>
+            <w:pPr>
+              <w:spacing w:before="0" w:after="0"/>
+            </w:pPr>
+            <w:r>
+              <w:rPr>
+                <w:rFonts w:ascii="Arial" w:cs="Arial" w:eastAsia="Arial" w:hAnsi="Arial"/>
+                <w:sz w:val="20"/>
+                <w:szCs w:val="20"/>
+              </w:rPr>
+              <w:t xml:space="preserve">Yes</w:t>
+            </w:r>
+          </w:p>
+        </w:tc>
+        <w:tc>
+          <w:tcPr>
+            <w:tcW w:type="dxa" w:w="1400"/>
+            <w:tcBorders>
+              <w:top w:val="single" w:color="000000" w:sz="4"/>
+              <w:left w:val="single" w:color="000000" w:sz="4"/>
+              <w:bottom w:val="single" w:color="000000" w:sz="4"/>
+              <w:right w:val="single" w:color="000000" w:sz="4"/>
+            </w:tcBorders>
+            <w:tcMar>
+              <w:top w:type="dxa" w:w="60"/>
+              <w:left w:type="dxa" w:w="100"/>
+              <w:bottom w:type="dxa" w:w="60"/>
+              <w:right w:type="dxa" w:w="100"/>
+            </w:tcMar>
+            <w:vAlign w:val="top"/>
+          </w:tcPr>
+          <w:p>
+            <w:pPr>
+              <w:spacing w:before="0" w:after="0"/>
+            </w:pPr>
+            <w:r>
+              <w:rPr>
+                <w:rFonts w:ascii="Arial" w:cs="Arial" w:eastAsia="Arial" w:hAnsi="Arial"/>
+                <w:sz w:val="20"/>
+                <w:szCs w:val="20"/>
+              </w:rPr>
+              <w:t xml:space="preserve">Yes</w:t>
+            </w:r>
+          </w:p>
+        </w:tc>
+        <w:tc>
+          <w:tcPr>
+            <w:tcW w:type="dxa" w:w="1400"/>
+            <w:tcBorders>
+              <w:top w:val="single" w:color="000000" w:sz="4"/>
+              <w:left w:val="single" w:color="000000" w:sz="4"/>
+              <w:bottom w:val="single" w:color="000000" w:sz="4"/>
+              <w:right w:val="single" w:color="000000" w:sz="4"/>
+            </w:tcBorders>
+            <w:tcMar>
+              <w:top w:type="dxa" w:w="60"/>
+              <w:left w:type="dxa" w:w="100"/>
+              <w:bottom w:type="dxa" w:w="60"/>
+              <w:right w:type="dxa" w:w="100"/>
+            </w:tcMar>
+            <w:vAlign w:val="top"/>
+          </w:tcPr>
+          <w:p>
+            <w:pPr>
+              <w:spacing w:before="0" w:after="0"/>
+            </w:pPr>
+            <w:r>
+              <w:rPr>
+                <w:rFonts w:ascii="Arial" w:cs="Arial" w:eastAsia="Arial" w:hAnsi="Arial"/>
+                <w:sz w:val="20"/>
+                <w:szCs w:val="20"/>
+              </w:rPr>
+              <w:t xml:space="preserve">Yes</w:t>
+            </w:r>
+          </w:p>
+        </w:tc>
+        <w:tc>
+          <w:tcPr>
+            <w:tcW w:type="dxa" w:w="1400"/>
+            <w:tcBorders>
+              <w:top w:val="single" w:color="000000" w:sz="4"/>
+              <w:left w:val="single" w:color="000000" w:sz="4"/>
+              <w:bottom w:val="single" w:color="000000" w:sz="4"/>
+              <w:right w:val="single" w:color="000000" w:sz="4"/>
+            </w:tcBorders>
+            <w:tcMar>
+              <w:top w:type="dxa" w:w="60"/>
+              <w:left w:type="dxa" w:w="100"/>
+              <w:bottom w:type="dxa" w:w="60"/>
+              <w:right w:type="dxa" w:w="100"/>
+            </w:tcMar>
+            <w:vAlign w:val="top"/>
+          </w:tcPr>
+          <w:p>
+            <w:pPr>
+              <w:spacing w:before="0" w:after="0"/>
+            </w:pPr>
+            <w:r>
+              <w:rPr>
+                <w:rFonts w:ascii="Arial" w:cs="Arial" w:eastAsia="Arial" w:hAnsi="Arial"/>
+                <w:sz w:val="20"/>
+                <w:szCs w:val="20"/>
+              </w:rPr>
+              <w:t xml:space="preserve">Yes</w:t>
+            </w:r>
+          </w:p>
+        </w:tc>
+      </w:tr>
+      <w:tr>
+        <w:trPr>
+          <w:cantSplit/>
+        </w:trPr>
+        <w:tc>
+          <w:tcPr>
+            <w:tcW w:type="dxa" w:w="2906"/>
+            <w:tcBorders>
+              <w:top w:val="single" w:color="000000" w:sz="4"/>
+              <w:left w:val="single" w:color="000000" w:sz="4"/>
+              <w:bottom w:val="single" w:color="000000" w:sz="4"/>
+              <w:right w:val="single" w:color="000000" w:sz="4"/>
+            </w:tcBorders>
+            <w:tcMar>
+              <w:top w:type="dxa" w:w="60"/>
+              <w:left w:type="dxa" w:w="100"/>
+              <w:bottom w:type="dxa" w:w="60"/>
+              <w:right w:type="dxa" w:w="100"/>
+            </w:tcMar>
+            <w:vAlign w:val="top"/>
+          </w:tcPr>
+          <w:p>
+            <w:pPr>
+              <w:spacing w:before="0" w:after="0"/>
+            </w:pPr>
+            <w:r>
+              <w:rPr>
+                <w:rFonts w:ascii="Arial" w:cs="Arial" w:eastAsia="Arial" w:hAnsi="Arial"/>
+                <w:sz w:val="20"/>
+                <w:szCs w:val="20"/>
+              </w:rPr>
+              <w:t xml:space="preserve">Incident register and records</w:t>
+            </w:r>
+          </w:p>
+        </w:tc>
+        <w:tc>
+          <w:tcPr>
+            <w:tcW w:type="dxa" w:w="1400"/>
+            <w:tcBorders>
+              <w:top w:val="single" w:color="000000" w:sz="4"/>
+              <w:left w:val="single" w:color="000000" w:sz="4"/>
+              <w:bottom w:val="single" w:color="000000" w:sz="4"/>
+              <w:right w:val="single" w:color="000000" w:sz="4"/>
+            </w:tcBorders>
+            <w:tcMar>
+              <w:top w:type="dxa" w:w="60"/>
+              <w:left w:type="dxa" w:w="100"/>
+              <w:bottom w:type="dxa" w:w="60"/>
+              <w:right w:type="dxa" w:w="100"/>
+            </w:tcMar>
+            <w:vAlign w:val="top"/>
+          </w:tcPr>
+          <w:p>
+            <w:pPr>
+              <w:spacing w:before="0" w:after="0"/>
+            </w:pPr>
+            <w:r>
+              <w:rPr>
+                <w:rFonts w:ascii="Arial" w:cs="Arial" w:eastAsia="Arial" w:hAnsi="Arial"/>
+                <w:sz w:val="20"/>
+                <w:szCs w:val="20"/>
+              </w:rPr>
+              <w:t xml:space="preserve">Yes</w:t>
+            </w:r>
+          </w:p>
+        </w:tc>
+        <w:tc>
+          <w:tcPr>
+            <w:tcW w:type="dxa" w:w="1400"/>
+            <w:tcBorders>
+              <w:top w:val="single" w:color="000000" w:sz="4"/>
+              <w:left w:val="single" w:color="000000" w:sz="4"/>
+              <w:bottom w:val="single" w:color="000000" w:sz="4"/>
+              <w:right w:val="single" w:color="000000" w:sz="4"/>
+            </w:tcBorders>
+            <w:tcMar>
+              <w:top w:type="dxa" w:w="60"/>
+              <w:left w:type="dxa" w:w="100"/>
+              <w:bottom w:type="dxa" w:w="60"/>
+              <w:right w:type="dxa" w:w="100"/>
+            </w:tcMar>
+            <w:vAlign w:val="top"/>
+          </w:tcPr>
+          <w:p>
+            <w:pPr>
+              <w:spacing w:before="0" w:after="0"/>
+            </w:pPr>
+            <w:r>
+              <w:rPr>
+                <w:rFonts w:ascii="Arial" w:cs="Arial" w:eastAsia="Arial" w:hAnsi="Arial"/>
+                <w:sz w:val="20"/>
+                <w:szCs w:val="20"/>
+              </w:rPr>
+              <w:t xml:space="preserve">Yes</w:t>
+            </w:r>
+          </w:p>
+        </w:tc>
+        <w:tc>
+          <w:tcPr>
+            <w:tcW w:type="dxa" w:w="1400"/>
+            <w:tcBorders>
+              <w:top w:val="single" w:color="000000" w:sz="4"/>
+              <w:left w:val="single" w:color="000000" w:sz="4"/>
+              <w:bottom w:val="single" w:color="000000" w:sz="4"/>
+              <w:right w:val="single" w:color="000000" w:sz="4"/>
+            </w:tcBorders>
+            <w:tcMar>
+              <w:top w:type="dxa" w:w="60"/>
+              <w:left w:type="dxa" w:w="100"/>
+              <w:bottom w:type="dxa" w:w="60"/>
+              <w:right w:type="dxa" w:w="100"/>
+            </w:tcMar>
+            <w:vAlign w:val="top"/>
+          </w:tcPr>
+          <w:p>
+            <w:pPr>
+              <w:spacing w:before="0" w:after="0"/>
+            </w:pPr>
+            <w:r>
+              <w:rPr>
+                <w:rFonts w:ascii="Arial" w:cs="Arial" w:eastAsia="Arial" w:hAnsi="Arial"/>
+                <w:sz w:val="20"/>
+                <w:szCs w:val="20"/>
+              </w:rPr>
+              <w:t xml:space="preserve">Yes</w:t>
+            </w:r>
+          </w:p>
+        </w:tc>
+        <w:tc>
+          <w:tcPr>
+            <w:tcW w:type="dxa" w:w="1400"/>
+            <w:tcBorders>
+              <w:top w:val="single" w:color="000000" w:sz="4"/>
+              <w:left w:val="single" w:color="000000" w:sz="4"/>
+              <w:bottom w:val="single" w:color="000000" w:sz="4"/>
+              <w:right w:val="single" w:color="000000" w:sz="4"/>
+            </w:tcBorders>
+            <w:tcMar>
+              <w:top w:type="dxa" w:w="60"/>
+              <w:left w:type="dxa" w:w="100"/>
+              <w:bottom w:type="dxa" w:w="60"/>
+              <w:right w:type="dxa" w:w="100"/>
+            </w:tcMar>
+            <w:vAlign w:val="top"/>
+          </w:tcPr>
+          <w:p>
+            <w:pPr>
+              <w:spacing w:before="0" w:after="0"/>
+            </w:pPr>
+            <w:r>
+              <w:rPr>
+                <w:rFonts w:ascii="Arial" w:cs="Arial" w:eastAsia="Arial" w:hAnsi="Arial"/>
+                <w:sz w:val="20"/>
+                <w:szCs w:val="20"/>
+              </w:rPr>
+              <w:t xml:space="preserve">Yes</w:t>
+            </w:r>
+          </w:p>
+        </w:tc>
+        <w:tc>
+          <w:tcPr>
+            <w:tcW w:type="dxa" w:w="1400"/>
+            <w:tcBorders>
+              <w:top w:val="single" w:color="000000" w:sz="4"/>
+              <w:left w:val="single" w:color="000000" w:sz="4"/>
+              <w:bottom w:val="single" w:color="000000" w:sz="4"/>
+              <w:right w:val="single" w:color="000000" w:sz="4"/>
+            </w:tcBorders>
+            <w:tcMar>
+              <w:top w:type="dxa" w:w="60"/>
+              <w:left w:type="dxa" w:w="100"/>
+              <w:bottom w:type="dxa" w:w="60"/>
+              <w:right w:type="dxa" w:w="100"/>
+            </w:tcMar>
+            <w:vAlign w:val="top"/>
+          </w:tcPr>
+          <w:p>
+            <w:pPr>
+              <w:spacing w:before="0" w:after="0"/>
+            </w:pPr>
+            <w:r>
+              <w:rPr>
+                <w:rFonts w:ascii="Arial" w:cs="Arial" w:eastAsia="Arial" w:hAnsi="Arial"/>
+                <w:sz w:val="20"/>
+                <w:szCs w:val="20"/>
+              </w:rPr>
+              <w:t xml:space="preserve">Yes</w:t>
+            </w:r>
+          </w:p>
+        </w:tc>
+      </w:tr>
+      <w:tr>
+        <w:trPr>
+          <w:cantSplit/>
+        </w:trPr>
+        <w:tc>
+          <w:tcPr>
+            <w:tcW w:type="dxa" w:w="2906"/>
+            <w:tcBorders>
+              <w:top w:val="single" w:color="000000" w:sz="4"/>
+              <w:left w:val="single" w:color="000000" w:sz="4"/>
+              <w:bottom w:val="single" w:color="000000" w:sz="4"/>
+              <w:right w:val="single" w:color="000000" w:sz="4"/>
+            </w:tcBorders>
+            <w:tcMar>
+              <w:top w:type="dxa" w:w="60"/>
+              <w:left w:type="dxa" w:w="100"/>
+              <w:bottom w:type="dxa" w:w="60"/>
+              <w:right w:type="dxa" w:w="100"/>
+            </w:tcMar>
+            <w:vAlign w:val="top"/>
+          </w:tcPr>
+          <w:p>
+            <w:pPr>
+              <w:spacing w:before="0" w:after="0"/>
+            </w:pPr>
+            <w:r>
+              <w:rPr>
+                <w:rFonts w:ascii="Arial" w:cs="Arial" w:eastAsia="Arial" w:hAnsi="Arial"/>
+                <w:sz w:val="20"/>
+                <w:szCs w:val="20"/>
+              </w:rPr>
+              <w:t xml:space="preserve">File new incidents</w:t>
+            </w:r>
+          </w:p>
+        </w:tc>
+        <w:tc>
+          <w:tcPr>
+            <w:tcW w:type="dxa" w:w="1400"/>
+            <w:tcBorders>
+              <w:top w:val="single" w:color="000000" w:sz="4"/>
+              <w:left w:val="single" w:color="000000" w:sz="4"/>
+              <w:bottom w:val="single" w:color="000000" w:sz="4"/>
+              <w:right w:val="single" w:color="000000" w:sz="4"/>
+            </w:tcBorders>
+            <w:tcMar>
+              <w:top w:type="dxa" w:w="60"/>
+              <w:left w:type="dxa" w:w="100"/>
+              <w:bottom w:type="dxa" w:w="60"/>
+              <w:right w:type="dxa" w:w="100"/>
+            </w:tcMar>
+            <w:vAlign w:val="top"/>
+          </w:tcPr>
+          <w:p>
+            <w:pPr>
+              <w:spacing w:before="0" w:after="0"/>
+            </w:pPr>
+            <w:r>
+              <w:rPr>
+                <w:rFonts w:ascii="Arial" w:cs="Arial" w:eastAsia="Arial" w:hAnsi="Arial"/>
+                <w:sz w:val="20"/>
+                <w:szCs w:val="20"/>
+              </w:rPr>
+              <w:t xml:space="preserve">Yes</w:t>
+            </w:r>
+          </w:p>
+        </w:tc>
+        <w:tc>
+          <w:tcPr>
+            <w:tcW w:type="dxa" w:w="1400"/>
+            <w:tcBorders>
+              <w:top w:val="single" w:color="000000" w:sz="4"/>
+              <w:left w:val="single" w:color="000000" w:sz="4"/>
+              <w:bottom w:val="single" w:color="000000" w:sz="4"/>
+              <w:right w:val="single" w:color="000000" w:sz="4"/>
+            </w:tcBorders>
+            <w:tcMar>
+              <w:top w:type="dxa" w:w="60"/>
+              <w:left w:type="dxa" w:w="100"/>
+              <w:bottom w:type="dxa" w:w="60"/>
+              <w:right w:type="dxa" w:w="100"/>
+            </w:tcMar>
+            <w:vAlign w:val="top"/>
+          </w:tcPr>
+          <w:p>
+            <w:pPr>
+              <w:spacing w:before="0" w:after="0"/>
+            </w:pPr>
+            <w:r>
+              <w:rPr>
+                <w:rFonts w:ascii="Arial" w:cs="Arial" w:eastAsia="Arial" w:hAnsi="Arial"/>
+                <w:sz w:val="20"/>
+                <w:szCs w:val="20"/>
+              </w:rPr>
+              <w:t xml:space="preserve">Yes</w:t>
+            </w:r>
+          </w:p>
+        </w:tc>
+        <w:tc>
+          <w:tcPr>
+            <w:tcW w:type="dxa" w:w="1400"/>
+            <w:tcBorders>
+              <w:top w:val="single" w:color="000000" w:sz="4"/>
+              <w:left w:val="single" w:color="000000" w:sz="4"/>
+              <w:bottom w:val="single" w:color="000000" w:sz="4"/>
+              <w:right w:val="single" w:color="000000" w:sz="4"/>
+            </w:tcBorders>
+            <w:tcMar>
+              <w:top w:type="dxa" w:w="60"/>
+              <w:left w:type="dxa" w:w="100"/>
+              <w:bottom w:type="dxa" w:w="60"/>
+              <w:right w:type="dxa" w:w="100"/>
+            </w:tcMar>
+            <w:vAlign w:val="top"/>
+          </w:tcPr>
+          <w:p>
+            <w:pPr>
+              <w:spacing w:before="0" w:after="0"/>
+            </w:pPr>
+            <w:r>
+              <w:rPr>
+                <w:rFonts w:ascii="Arial" w:cs="Arial" w:eastAsia="Arial" w:hAnsi="Arial"/>
+                <w:sz w:val="20"/>
+                <w:szCs w:val="20"/>
+              </w:rPr>
+              <w:t xml:space="preserve">Yes</w:t>
+            </w:r>
+          </w:p>
+        </w:tc>
+        <w:tc>
+          <w:tcPr>
+            <w:tcW w:type="dxa" w:w="1400"/>
+            <w:tcBorders>
+              <w:top w:val="single" w:color="000000" w:sz="4"/>
+              <w:left w:val="single" w:color="000000" w:sz="4"/>
+              <w:bottom w:val="single" w:color="000000" w:sz="4"/>
+              <w:right w:val="single" w:color="000000" w:sz="4"/>
+            </w:tcBorders>
+            <w:tcMar>
+              <w:top w:type="dxa" w:w="60"/>
+              <w:left w:type="dxa" w:w="100"/>
+              <w:bottom w:type="dxa" w:w="60"/>
+              <w:right w:type="dxa" w:w="100"/>
+            </w:tcMar>
+            <w:vAlign w:val="top"/>
+          </w:tcPr>
+          <w:p>
+            <w:pPr>
+              <w:spacing w:before="0" w:after="0"/>
+            </w:pPr>
+            <w:r>
+              <w:rPr>
+                <w:rFonts w:ascii="Arial" w:cs="Arial" w:eastAsia="Arial" w:hAnsi="Arial"/>
+                <w:sz w:val="20"/>
+                <w:szCs w:val="20"/>
+              </w:rPr>
+              <w:t xml:space="preserve">—</w:t>
+            </w:r>
+          </w:p>
+        </w:tc>
+        <w:tc>
+          <w:tcPr>
+            <w:tcW w:type="dxa" w:w="1400"/>
+            <w:tcBorders>
+              <w:top w:val="single" w:color="000000" w:sz="4"/>
+              <w:left w:val="single" w:color="000000" w:sz="4"/>
+              <w:bottom w:val="single" w:color="000000" w:sz="4"/>
+              <w:right w:val="single" w:color="000000" w:sz="4"/>
+            </w:tcBorders>
+            <w:tcMar>
+              <w:top w:type="dxa" w:w="60"/>
+              <w:left w:type="dxa" w:w="100"/>
+              <w:bottom w:type="dxa" w:w="60"/>
+              <w:right w:type="dxa" w:w="100"/>
+            </w:tcMar>
+            <w:vAlign w:val="top"/>
+          </w:tcPr>
+          <w:p>
+            <w:pPr>
+              <w:spacing w:before="0" w:after="0"/>
+            </w:pPr>
+            <w:r>
+              <w:rPr>
+                <w:rFonts w:ascii="Arial" w:cs="Arial" w:eastAsia="Arial" w:hAnsi="Arial"/>
+                <w:sz w:val="20"/>
+                <w:szCs w:val="20"/>
+              </w:rPr>
+              <w:t xml:space="preserve">—</w:t>
+            </w:r>
+          </w:p>
+        </w:tc>
+      </w:tr>
+      <w:tr>
+        <w:trPr>
+          <w:cantSplit/>
+        </w:trPr>
+        <w:tc>
+          <w:tcPr>
+            <w:tcW w:type="dxa" w:w="2906"/>
+            <w:tcBorders>
+              <w:top w:val="single" w:color="000000" w:sz="4"/>
+              <w:left w:val="single" w:color="000000" w:sz="4"/>
+              <w:bottom w:val="single" w:color="000000" w:sz="4"/>
+              <w:right w:val="single" w:color="000000" w:sz="4"/>
+            </w:tcBorders>
+            <w:tcMar>
+              <w:top w:type="dxa" w:w="60"/>
+              <w:left w:type="dxa" w:w="100"/>
+              <w:bottom w:type="dxa" w:w="60"/>
+              <w:right w:type="dxa" w:w="100"/>
+            </w:tcMar>
+            <w:vAlign w:val="top"/>
+          </w:tcPr>
+          <w:p>
+            <w:pPr>
+              <w:spacing w:before="0" w:after="0"/>
+            </w:pPr>
+            <w:r>
+              <w:rPr>
+                <w:rFonts w:ascii="Arial" w:cs="Arial" w:eastAsia="Arial" w:hAnsi="Arial"/>
+                <w:sz w:val="20"/>
+                <w:szCs w:val="20"/>
+              </w:rPr>
+              <w:t xml:space="preserve">GIS map</w:t>
+            </w:r>
+          </w:p>
+        </w:tc>
+        <w:tc>
+          <w:tcPr>
+            <w:tcW w:type="dxa" w:w="1400"/>
+            <w:tcBorders>
+              <w:top w:val="single" w:color="000000" w:sz="4"/>
+              <w:left w:val="single" w:color="000000" w:sz="4"/>
+              <w:bottom w:val="single" w:color="000000" w:sz="4"/>
+              <w:right w:val="single" w:color="000000" w:sz="4"/>
+            </w:tcBorders>
+            <w:tcMar>
+              <w:top w:type="dxa" w:w="60"/>
+              <w:left w:type="dxa" w:w="100"/>
+              <w:bottom w:type="dxa" w:w="60"/>
+              <w:right w:type="dxa" w:w="100"/>
+            </w:tcMar>
+            <w:vAlign w:val="top"/>
+          </w:tcPr>
+          <w:p>
+            <w:pPr>
+              <w:spacing w:before="0" w:after="0"/>
+            </w:pPr>
+            <w:r>
+              <w:rPr>
+                <w:rFonts w:ascii="Arial" w:cs="Arial" w:eastAsia="Arial" w:hAnsi="Arial"/>
+                <w:sz w:val="20"/>
+                <w:szCs w:val="20"/>
+              </w:rPr>
+              <w:t xml:space="preserve">Yes</w:t>
+            </w:r>
+          </w:p>
+        </w:tc>
+        <w:tc>
+          <w:tcPr>
+            <w:tcW w:type="dxa" w:w="1400"/>
+            <w:tcBorders>
+              <w:top w:val="single" w:color="000000" w:sz="4"/>
+              <w:left w:val="single" w:color="000000" w:sz="4"/>
+              <w:bottom w:val="single" w:color="000000" w:sz="4"/>
+              <w:right w:val="single" w:color="000000" w:sz="4"/>
+            </w:tcBorders>
+            <w:tcMar>
+              <w:top w:type="dxa" w:w="60"/>
+              <w:left w:type="dxa" w:w="100"/>
+              <w:bottom w:type="dxa" w:w="60"/>
+              <w:right w:type="dxa" w:w="100"/>
+            </w:tcMar>
+            <w:vAlign w:val="top"/>
+          </w:tcPr>
+          <w:p>
+            <w:pPr>
+              <w:spacing w:before="0" w:after="0"/>
+            </w:pPr>
+            <w:r>
+              <w:rPr>
+                <w:rFonts w:ascii="Arial" w:cs="Arial" w:eastAsia="Arial" w:hAnsi="Arial"/>
+                <w:sz w:val="20"/>
+                <w:szCs w:val="20"/>
+              </w:rPr>
+              <w:t xml:space="preserve">Yes</w:t>
+            </w:r>
+          </w:p>
+        </w:tc>
+        <w:tc>
+          <w:tcPr>
+            <w:tcW w:type="dxa" w:w="1400"/>
+            <w:tcBorders>
+              <w:top w:val="single" w:color="000000" w:sz="4"/>
+              <w:left w:val="single" w:color="000000" w:sz="4"/>
+              <w:bottom w:val="single" w:color="000000" w:sz="4"/>
+              <w:right w:val="single" w:color="000000" w:sz="4"/>
+            </w:tcBorders>
+            <w:tcMar>
+              <w:top w:type="dxa" w:w="60"/>
+              <w:left w:type="dxa" w:w="100"/>
+              <w:bottom w:type="dxa" w:w="60"/>
+              <w:right w:type="dxa" w:w="100"/>
+            </w:tcMar>
+            <w:vAlign w:val="top"/>
+          </w:tcPr>
+          <w:p>
+            <w:pPr>
+              <w:spacing w:before="0" w:after="0"/>
+            </w:pPr>
+            <w:r>
+              <w:rPr>
+                <w:rFonts w:ascii="Arial" w:cs="Arial" w:eastAsia="Arial" w:hAnsi="Arial"/>
+                <w:sz w:val="20"/>
+                <w:szCs w:val="20"/>
+              </w:rPr>
+              <w:t xml:space="preserve">Yes</w:t>
+            </w:r>
+          </w:p>
+        </w:tc>
+        <w:tc>
+          <w:tcPr>
+            <w:tcW w:type="dxa" w:w="1400"/>
+            <w:tcBorders>
+              <w:top w:val="single" w:color="000000" w:sz="4"/>
+              <w:left w:val="single" w:color="000000" w:sz="4"/>
+              <w:bottom w:val="single" w:color="000000" w:sz="4"/>
+              <w:right w:val="single" w:color="000000" w:sz="4"/>
+            </w:tcBorders>
+            <w:tcMar>
+              <w:top w:type="dxa" w:w="60"/>
+              <w:left w:type="dxa" w:w="100"/>
+              <w:bottom w:type="dxa" w:w="60"/>
+              <w:right w:type="dxa" w:w="100"/>
+            </w:tcMar>
+            <w:vAlign w:val="top"/>
+          </w:tcPr>
+          <w:p>
+            <w:pPr>
+              <w:spacing w:before="0" w:after="0"/>
+            </w:pPr>
+            <w:r>
+              <w:rPr>
+                <w:rFonts w:ascii="Arial" w:cs="Arial" w:eastAsia="Arial" w:hAnsi="Arial"/>
+                <w:sz w:val="20"/>
+                <w:szCs w:val="20"/>
+              </w:rPr>
+              <w:t xml:space="preserve">Yes</w:t>
+            </w:r>
+          </w:p>
+        </w:tc>
+        <w:tc>
+          <w:tcPr>
+            <w:tcW w:type="dxa" w:w="1400"/>
+            <w:tcBorders>
+              <w:top w:val="single" w:color="000000" w:sz="4"/>
+              <w:left w:val="single" w:color="000000" w:sz="4"/>
+              <w:bottom w:val="single" w:color="000000" w:sz="4"/>
+              <w:right w:val="single" w:color="000000" w:sz="4"/>
+            </w:tcBorders>
+            <w:tcMar>
+              <w:top w:type="dxa" w:w="60"/>
+              <w:left w:type="dxa" w:w="100"/>
+              <w:bottom w:type="dxa" w:w="60"/>
+              <w:right w:type="dxa" w:w="100"/>
+            </w:tcMar>
+            <w:vAlign w:val="top"/>
+          </w:tcPr>
+          <w:p>
+            <w:pPr>
+              <w:spacing w:before="0" w:after="0"/>
+            </w:pPr>
+            <w:r>
+              <w:rPr>
+                <w:rFonts w:ascii="Arial" w:cs="Arial" w:eastAsia="Arial" w:hAnsi="Arial"/>
+                <w:sz w:val="20"/>
+                <w:szCs w:val="20"/>
+              </w:rPr>
+              <w:t xml:space="preserve">—</w:t>
+            </w:r>
+          </w:p>
+        </w:tc>
+      </w:tr>
+      <w:tr>
+        <w:trPr>
+          <w:cantSplit/>
+        </w:trPr>
+        <w:tc>
+          <w:tcPr>
+            <w:tcW w:type="dxa" w:w="2906"/>
+            <w:tcBorders>
+              <w:top w:val="single" w:color="000000" w:sz="4"/>
+              <w:left w:val="single" w:color="000000" w:sz="4"/>
+              <w:bottom w:val="single" w:color="000000" w:sz="4"/>
+              <w:right w:val="single" w:color="000000" w:sz="4"/>
+            </w:tcBorders>
+            <w:tcMar>
+              <w:top w:type="dxa" w:w="60"/>
+              <w:left w:type="dxa" w:w="100"/>
+              <w:bottom w:type="dxa" w:w="60"/>
+              <w:right w:type="dxa" w:w="100"/>
+            </w:tcMar>
+            <w:vAlign w:val="top"/>
+          </w:tcPr>
+          <w:p>
+            <w:pPr>
+              <w:spacing w:before="0" w:after="0"/>
+            </w:pPr>
+            <w:r>
+              <w:rPr>
+                <w:rFonts w:ascii="Arial" w:cs="Arial" w:eastAsia="Arial" w:hAnsi="Arial"/>
+                <w:sz w:val="20"/>
+                <w:szCs w:val="20"/>
+              </w:rPr>
+              <w:t xml:space="preserve">Analytics</w:t>
+            </w:r>
+          </w:p>
+        </w:tc>
+        <w:tc>
+          <w:tcPr>
+            <w:tcW w:type="dxa" w:w="1400"/>
+            <w:tcBorders>
+              <w:top w:val="single" w:color="000000" w:sz="4"/>
+              <w:left w:val="single" w:color="000000" w:sz="4"/>
+              <w:bottom w:val="single" w:color="000000" w:sz="4"/>
+              <w:right w:val="single" w:color="000000" w:sz="4"/>
+            </w:tcBorders>
+            <w:tcMar>
+              <w:top w:type="dxa" w:w="60"/>
+              <w:left w:type="dxa" w:w="100"/>
+              <w:bottom w:type="dxa" w:w="60"/>
+              <w:right w:type="dxa" w:w="100"/>
+            </w:tcMar>
+            <w:vAlign w:val="top"/>
+          </w:tcPr>
+          <w:p>
+            <w:pPr>
+              <w:spacing w:before="0" w:after="0"/>
+            </w:pPr>
+            <w:r>
+              <w:rPr>
+                <w:rFonts w:ascii="Arial" w:cs="Arial" w:eastAsia="Arial" w:hAnsi="Arial"/>
+                <w:sz w:val="20"/>
+                <w:szCs w:val="20"/>
+              </w:rPr>
+              <w:t xml:space="preserve">Yes</w:t>
+            </w:r>
+          </w:p>
+        </w:tc>
+        <w:tc>
+          <w:tcPr>
+            <w:tcW w:type="dxa" w:w="1400"/>
+            <w:tcBorders>
+              <w:top w:val="single" w:color="000000" w:sz="4"/>
+              <w:left w:val="single" w:color="000000" w:sz="4"/>
+              <w:bottom w:val="single" w:color="000000" w:sz="4"/>
+              <w:right w:val="single" w:color="000000" w:sz="4"/>
+            </w:tcBorders>
+            <w:tcMar>
+              <w:top w:type="dxa" w:w="60"/>
+              <w:left w:type="dxa" w:w="100"/>
+              <w:bottom w:type="dxa" w:w="60"/>
+              <w:right w:type="dxa" w:w="100"/>
+            </w:tcMar>
+            <w:vAlign w:val="top"/>
+          </w:tcPr>
+          <w:p>
+            <w:pPr>
+              <w:spacing w:before="0" w:after="0"/>
+            </w:pPr>
+            <w:r>
+              <w:rPr>
+                <w:rFonts w:ascii="Arial" w:cs="Arial" w:eastAsia="Arial" w:hAnsi="Arial"/>
+                <w:sz w:val="20"/>
+                <w:szCs w:val="20"/>
+              </w:rPr>
+              <w:t xml:space="preserve">Yes</w:t>
+            </w:r>
+          </w:p>
+        </w:tc>
+        <w:tc>
+          <w:tcPr>
+            <w:tcW w:type="dxa" w:w="1400"/>
+            <w:tcBorders>
+              <w:top w:val="single" w:color="000000" w:sz="4"/>
+              <w:left w:val="single" w:color="000000" w:sz="4"/>
+              <w:bottom w:val="single" w:color="000000" w:sz="4"/>
+              <w:right w:val="single" w:color="000000" w:sz="4"/>
+            </w:tcBorders>
+            <w:tcMar>
+              <w:top w:type="dxa" w:w="60"/>
+              <w:left w:type="dxa" w:w="100"/>
+              <w:bottom w:type="dxa" w:w="60"/>
+              <w:right w:type="dxa" w:w="100"/>
+            </w:tcMar>
+            <w:vAlign w:val="top"/>
+          </w:tcPr>
+          <w:p>
+            <w:pPr>
+              <w:spacing w:before="0" w:after="0"/>
+            </w:pPr>
+            <w:r>
+              <w:rPr>
+                <w:rFonts w:ascii="Arial" w:cs="Arial" w:eastAsia="Arial" w:hAnsi="Arial"/>
+                <w:sz w:val="20"/>
+                <w:szCs w:val="20"/>
+              </w:rPr>
+              <w:t xml:space="preserve">—</w:t>
+            </w:r>
+          </w:p>
+        </w:tc>
+        <w:tc>
+          <w:tcPr>
+            <w:tcW w:type="dxa" w:w="1400"/>
+            <w:tcBorders>
+              <w:top w:val="single" w:color="000000" w:sz="4"/>
+              <w:left w:val="single" w:color="000000" w:sz="4"/>
+              <w:bottom w:val="single" w:color="000000" w:sz="4"/>
+              <w:right w:val="single" w:color="000000" w:sz="4"/>
+            </w:tcBorders>
+            <w:tcMar>
+              <w:top w:type="dxa" w:w="60"/>
+              <w:left w:type="dxa" w:w="100"/>
+              <w:bottom w:type="dxa" w:w="60"/>
+              <w:right w:type="dxa" w:w="100"/>
+            </w:tcMar>
+            <w:vAlign w:val="top"/>
+          </w:tcPr>
+          <w:p>
+            <w:pPr>
+              <w:spacing w:before="0" w:after="0"/>
+            </w:pPr>
+            <w:r>
+              <w:rPr>
+                <w:rFonts w:ascii="Arial" w:cs="Arial" w:eastAsia="Arial" w:hAnsi="Arial"/>
+                <w:sz w:val="20"/>
+                <w:szCs w:val="20"/>
+              </w:rPr>
+              <w:t xml:space="preserve">Yes</w:t>
+            </w:r>
+          </w:p>
+        </w:tc>
+        <w:tc>
+          <w:tcPr>
+            <w:tcW w:type="dxa" w:w="1400"/>
+            <w:tcBorders>
+              <w:top w:val="single" w:color="000000" w:sz="4"/>
+              <w:left w:val="single" w:color="000000" w:sz="4"/>
+              <w:bottom w:val="single" w:color="000000" w:sz="4"/>
+              <w:right w:val="single" w:color="000000" w:sz="4"/>
+            </w:tcBorders>
+            <w:tcMar>
+              <w:top w:type="dxa" w:w="60"/>
+              <w:left w:type="dxa" w:w="100"/>
+              <w:bottom w:type="dxa" w:w="60"/>
+              <w:right w:type="dxa" w:w="100"/>
+            </w:tcMar>
+            <w:vAlign w:val="top"/>
+          </w:tcPr>
+          <w:p>
+            <w:pPr>
+              <w:spacing w:before="0" w:after="0"/>
+            </w:pPr>
+            <w:r>
+              <w:rPr>
+                <w:rFonts w:ascii="Arial" w:cs="Arial" w:eastAsia="Arial" w:hAnsi="Arial"/>
+                <w:sz w:val="20"/>
+                <w:szCs w:val="20"/>
+              </w:rPr>
+              <w:t xml:space="preserve">Yes</w:t>
+            </w:r>
+          </w:p>
+        </w:tc>
+      </w:tr>
+      <w:tr>
+        <w:trPr>
+          <w:cantSplit/>
+        </w:trPr>
+        <w:tc>
+          <w:tcPr>
+            <w:tcW w:type="dxa" w:w="2906"/>
+            <w:tcBorders>
+              <w:top w:val="single" w:color="000000" w:sz="4"/>
+              <w:left w:val="single" w:color="000000" w:sz="4"/>
+              <w:bottom w:val="single" w:color="000000" w:sz="4"/>
+              <w:right w:val="single" w:color="000000" w:sz="4"/>
+            </w:tcBorders>
+            <w:tcMar>
+              <w:top w:type="dxa" w:w="60"/>
+              <w:left w:type="dxa" w:w="100"/>
+              <w:bottom w:type="dxa" w:w="60"/>
+              <w:right w:type="dxa" w:w="100"/>
+            </w:tcMar>
+            <w:vAlign w:val="top"/>
+          </w:tcPr>
+          <w:p>
+            <w:pPr>
+              <w:spacing w:before="0" w:after="0"/>
+            </w:pPr>
+            <w:r>
+              <w:rPr>
+                <w:rFonts w:ascii="Arial" w:cs="Arial" w:eastAsia="Arial" w:hAnsi="Arial"/>
+                <w:sz w:val="20"/>
+                <w:szCs w:val="20"/>
+              </w:rPr>
+              <w:t xml:space="preserve">Reports and export</w:t>
+            </w:r>
+          </w:p>
+        </w:tc>
+        <w:tc>
+          <w:tcPr>
+            <w:tcW w:type="dxa" w:w="1400"/>
+            <w:tcBorders>
+              <w:top w:val="single" w:color="000000" w:sz="4"/>
+              <w:left w:val="single" w:color="000000" w:sz="4"/>
+              <w:bottom w:val="single" w:color="000000" w:sz="4"/>
+              <w:right w:val="single" w:color="000000" w:sz="4"/>
+            </w:tcBorders>
+            <w:tcMar>
+              <w:top w:type="dxa" w:w="60"/>
+              <w:left w:type="dxa" w:w="100"/>
+              <w:bottom w:type="dxa" w:w="60"/>
+              <w:right w:type="dxa" w:w="100"/>
+            </w:tcMar>
+            <w:vAlign w:val="top"/>
+          </w:tcPr>
+          <w:p>
+            <w:pPr>
+              <w:spacing w:before="0" w:after="0"/>
+            </w:pPr>
+            <w:r>
+              <w:rPr>
+                <w:rFonts w:ascii="Arial" w:cs="Arial" w:eastAsia="Arial" w:hAnsi="Arial"/>
+                <w:sz w:val="20"/>
+                <w:szCs w:val="20"/>
+              </w:rPr>
+              <w:t xml:space="preserve">Yes</w:t>
+            </w:r>
+          </w:p>
+        </w:tc>
+        <w:tc>
+          <w:tcPr>
+            <w:tcW w:type="dxa" w:w="1400"/>
+            <w:tcBorders>
+              <w:top w:val="single" w:color="000000" w:sz="4"/>
+              <w:left w:val="single" w:color="000000" w:sz="4"/>
+              <w:bottom w:val="single" w:color="000000" w:sz="4"/>
+              <w:right w:val="single" w:color="000000" w:sz="4"/>
+            </w:tcBorders>
+            <w:tcMar>
+              <w:top w:type="dxa" w:w="60"/>
+              <w:left w:type="dxa" w:w="100"/>
+              <w:bottom w:type="dxa" w:w="60"/>
+              <w:right w:type="dxa" w:w="100"/>
+            </w:tcMar>
+            <w:vAlign w:val="top"/>
+          </w:tcPr>
+          <w:p>
+            <w:pPr>
+              <w:spacing w:before="0" w:after="0"/>
+            </w:pPr>
+            <w:r>
+              <w:rPr>
+                <w:rFonts w:ascii="Arial" w:cs="Arial" w:eastAsia="Arial" w:hAnsi="Arial"/>
+                <w:sz w:val="20"/>
+                <w:szCs w:val="20"/>
+              </w:rPr>
+              <w:t xml:space="preserve">Yes</w:t>
+            </w:r>
+          </w:p>
+        </w:tc>
+        <w:tc>
+          <w:tcPr>
+            <w:tcW w:type="dxa" w:w="1400"/>
+            <w:tcBorders>
+              <w:top w:val="single" w:color="000000" w:sz="4"/>
+              <w:left w:val="single" w:color="000000" w:sz="4"/>
+              <w:bottom w:val="single" w:color="000000" w:sz="4"/>
+              <w:right w:val="single" w:color="000000" w:sz="4"/>
+            </w:tcBorders>
+            <w:tcMar>
+              <w:top w:type="dxa" w:w="60"/>
+              <w:left w:type="dxa" w:w="100"/>
+              <w:bottom w:type="dxa" w:w="60"/>
+              <w:right w:type="dxa" w:w="100"/>
+            </w:tcMar>
+            <w:vAlign w:val="top"/>
+          </w:tcPr>
+          <w:p>
+            <w:pPr>
+              <w:spacing w:before="0" w:after="0"/>
+            </w:pPr>
+            <w:r>
+              <w:rPr>
+                <w:rFonts w:ascii="Arial" w:cs="Arial" w:eastAsia="Arial" w:hAnsi="Arial"/>
+                <w:sz w:val="20"/>
+                <w:szCs w:val="20"/>
+              </w:rPr>
+              <w:t xml:space="preserve">—</w:t>
+            </w:r>
+          </w:p>
+        </w:tc>
+        <w:tc>
+          <w:tcPr>
+            <w:tcW w:type="dxa" w:w="1400"/>
+            <w:tcBorders>
+              <w:top w:val="single" w:color="000000" w:sz="4"/>
+              <w:left w:val="single" w:color="000000" w:sz="4"/>
+              <w:bottom w:val="single" w:color="000000" w:sz="4"/>
+              <w:right w:val="single" w:color="000000" w:sz="4"/>
+            </w:tcBorders>
+            <w:tcMar>
+              <w:top w:type="dxa" w:w="60"/>
+              <w:left w:type="dxa" w:w="100"/>
+              <w:bottom w:type="dxa" w:w="60"/>
+              <w:right w:type="dxa" w:w="100"/>
+            </w:tcMar>
+            <w:vAlign w:val="top"/>
+          </w:tcPr>
+          <w:p>
+            <w:pPr>
+              <w:spacing w:before="0" w:after="0"/>
+            </w:pPr>
+            <w:r>
+              <w:rPr>
+                <w:rFonts w:ascii="Arial" w:cs="Arial" w:eastAsia="Arial" w:hAnsi="Arial"/>
+                <w:sz w:val="20"/>
+                <w:szCs w:val="20"/>
+              </w:rPr>
+              <w:t xml:space="preserve">Yes</w:t>
+            </w:r>
+          </w:p>
+        </w:tc>
+        <w:tc>
+          <w:tcPr>
+            <w:tcW w:type="dxa" w:w="1400"/>
+            <w:tcBorders>
+              <w:top w:val="single" w:color="000000" w:sz="4"/>
+              <w:left w:val="single" w:color="000000" w:sz="4"/>
+              <w:bottom w:val="single" w:color="000000" w:sz="4"/>
+              <w:right w:val="single" w:color="000000" w:sz="4"/>
+            </w:tcBorders>
+            <w:tcMar>
+              <w:top w:type="dxa" w:w="60"/>
+              <w:left w:type="dxa" w:w="100"/>
+              <w:bottom w:type="dxa" w:w="60"/>
+              <w:right w:type="dxa" w:w="100"/>
+            </w:tcMar>
+            <w:vAlign w:val="top"/>
+          </w:tcPr>
+          <w:p>
+            <w:pPr>
+              <w:spacing w:before="0" w:after="0"/>
+            </w:pPr>
+            <w:r>
+              <w:rPr>
+                <w:rFonts w:ascii="Arial" w:cs="Arial" w:eastAsia="Arial" w:hAnsi="Arial"/>
+                <w:sz w:val="20"/>
+                <w:szCs w:val="20"/>
+              </w:rPr>
+              <w:t xml:space="preserve">Yes</w:t>
+            </w:r>
+          </w:p>
+        </w:tc>
+      </w:tr>
+      <w:tr>
+        <w:trPr>
+          <w:cantSplit/>
+        </w:trPr>
+        <w:tc>
+          <w:tcPr>
+            <w:tcW w:type="dxa" w:w="2906"/>
+            <w:tcBorders>
+              <w:top w:val="single" w:color="000000" w:sz="4"/>
+              <w:left w:val="single" w:color="000000" w:sz="4"/>
+              <w:bottom w:val="single" w:color="000000" w:sz="4"/>
+              <w:right w:val="single" w:color="000000" w:sz="4"/>
+            </w:tcBorders>
+            <w:tcMar>
+              <w:top w:type="dxa" w:w="60"/>
+              <w:left w:type="dxa" w:w="100"/>
+              <w:bottom w:type="dxa" w:w="60"/>
+              <w:right w:type="dxa" w:w="100"/>
+            </w:tcMar>
+            <w:vAlign w:val="top"/>
+          </w:tcPr>
+          <w:p>
+            <w:pPr>
+              <w:spacing w:before="0" w:after="0"/>
+            </w:pPr>
+            <w:r>
+              <w:rPr>
+                <w:rFonts w:ascii="Arial" w:cs="Arial" w:eastAsia="Arial" w:hAnsi="Arial"/>
+                <w:sz w:val="20"/>
+                <w:szCs w:val="20"/>
+              </w:rPr>
+              <w:t xml:space="preserve">Audit trail</w:t>
+            </w:r>
+          </w:p>
+        </w:tc>
+        <w:tc>
+          <w:tcPr>
+            <w:tcW w:type="dxa" w:w="1400"/>
+            <w:tcBorders>
+              <w:top w:val="single" w:color="000000" w:sz="4"/>
+              <w:left w:val="single" w:color="000000" w:sz="4"/>
+              <w:bottom w:val="single" w:color="000000" w:sz="4"/>
+              <w:right w:val="single" w:color="000000" w:sz="4"/>
+            </w:tcBorders>
+            <w:tcMar>
+              <w:top w:type="dxa" w:w="60"/>
+              <w:left w:type="dxa" w:w="100"/>
+              <w:bottom w:type="dxa" w:w="60"/>
+              <w:right w:type="dxa" w:w="100"/>
+            </w:tcMar>
+            <w:vAlign w:val="top"/>
+          </w:tcPr>
+          <w:p>
+            <w:pPr>
+              <w:spacing w:before="0" w:after="0"/>
+            </w:pPr>
+            <w:r>
+              <w:rPr>
+                <w:rFonts w:ascii="Arial" w:cs="Arial" w:eastAsia="Arial" w:hAnsi="Arial"/>
+                <w:sz w:val="20"/>
+                <w:szCs w:val="20"/>
+              </w:rPr>
+              <w:t xml:space="preserve">Yes</w:t>
+            </w:r>
+          </w:p>
+        </w:tc>
+        <w:tc>
+          <w:tcPr>
+            <w:tcW w:type="dxa" w:w="1400"/>
+            <w:tcBorders>
+              <w:top w:val="single" w:color="000000" w:sz="4"/>
+              <w:left w:val="single" w:color="000000" w:sz="4"/>
+              <w:bottom w:val="single" w:color="000000" w:sz="4"/>
+              <w:right w:val="single" w:color="000000" w:sz="4"/>
+            </w:tcBorders>
+            <w:tcMar>
+              <w:top w:type="dxa" w:w="60"/>
+              <w:left w:type="dxa" w:w="100"/>
+              <w:bottom w:type="dxa" w:w="60"/>
+              <w:right w:type="dxa" w:w="100"/>
+            </w:tcMar>
+            <w:vAlign w:val="top"/>
+          </w:tcPr>
+          <w:p>
+            <w:pPr>
+              <w:spacing w:before="0" w:after="0"/>
+            </w:pPr>
+            <w:r>
+              <w:rPr>
+                <w:rFonts w:ascii="Arial" w:cs="Arial" w:eastAsia="Arial" w:hAnsi="Arial"/>
+                <w:sz w:val="20"/>
+                <w:szCs w:val="20"/>
+              </w:rPr>
+              <w:t xml:space="preserve">—</w:t>
+            </w:r>
+          </w:p>
+        </w:tc>
+        <w:tc>
+          <w:tcPr>
+            <w:tcW w:type="dxa" w:w="1400"/>
+            <w:tcBorders>
+              <w:top w:val="single" w:color="000000" w:sz="4"/>
+              <w:left w:val="single" w:color="000000" w:sz="4"/>
+              <w:bottom w:val="single" w:color="000000" w:sz="4"/>
+              <w:right w:val="single" w:color="000000" w:sz="4"/>
+            </w:tcBorders>
+            <w:tcMar>
+              <w:top w:type="dxa" w:w="60"/>
+              <w:left w:type="dxa" w:w="100"/>
+              <w:bottom w:type="dxa" w:w="60"/>
+              <w:right w:type="dxa" w:w="100"/>
+            </w:tcMar>
+            <w:vAlign w:val="top"/>
+          </w:tcPr>
+          <w:p>
+            <w:pPr>
+              <w:spacing w:before="0" w:after="0"/>
+            </w:pPr>
+            <w:r>
+              <w:rPr>
+                <w:rFonts w:ascii="Arial" w:cs="Arial" w:eastAsia="Arial" w:hAnsi="Arial"/>
+                <w:sz w:val="20"/>
+                <w:szCs w:val="20"/>
+              </w:rPr>
+              <w:t xml:space="preserve">—</w:t>
+            </w:r>
+          </w:p>
+        </w:tc>
+        <w:tc>
+          <w:tcPr>
+            <w:tcW w:type="dxa" w:w="1400"/>
+            <w:tcBorders>
+              <w:top w:val="single" w:color="000000" w:sz="4"/>
+              <w:left w:val="single" w:color="000000" w:sz="4"/>
+              <w:bottom w:val="single" w:color="000000" w:sz="4"/>
+              <w:right w:val="single" w:color="000000" w:sz="4"/>
+            </w:tcBorders>
+            <w:tcMar>
+              <w:top w:type="dxa" w:w="60"/>
+              <w:left w:type="dxa" w:w="100"/>
+              <w:bottom w:type="dxa" w:w="60"/>
+              <w:right w:type="dxa" w:w="100"/>
+            </w:tcMar>
+            <w:vAlign w:val="top"/>
+          </w:tcPr>
+          <w:p>
+            <w:pPr>
+              <w:spacing w:before="0" w:after="0"/>
+            </w:pPr>
+            <w:r>
+              <w:rPr>
+                <w:rFonts w:ascii="Arial" w:cs="Arial" w:eastAsia="Arial" w:hAnsi="Arial"/>
+                <w:sz w:val="20"/>
+                <w:szCs w:val="20"/>
+              </w:rPr>
+              <w:t xml:space="preserve">—</w:t>
+            </w:r>
+          </w:p>
+        </w:tc>
+        <w:tc>
+          <w:tcPr>
+            <w:tcW w:type="dxa" w:w="1400"/>
+            <w:tcBorders>
+              <w:top w:val="single" w:color="000000" w:sz="4"/>
+              <w:left w:val="single" w:color="000000" w:sz="4"/>
+              <w:bottom w:val="single" w:color="000000" w:sz="4"/>
+              <w:right w:val="single" w:color="000000" w:sz="4"/>
+            </w:tcBorders>
+            <w:tcMar>
+              <w:top w:type="dxa" w:w="60"/>
+              <w:left w:type="dxa" w:w="100"/>
+              <w:bottom w:type="dxa" w:w="60"/>
+              <w:right w:type="dxa" w:w="100"/>
+            </w:tcMar>
+            <w:vAlign w:val="top"/>
+          </w:tcPr>
+          <w:p>
+            <w:pPr>
+              <w:spacing w:before="0" w:after="0"/>
+            </w:pPr>
+            <w:r>
+              <w:rPr>
+                <w:rFonts w:ascii="Arial" w:cs="Arial" w:eastAsia="Arial" w:hAnsi="Arial"/>
+                <w:sz w:val="20"/>
+                <w:szCs w:val="20"/>
+              </w:rPr>
+              <w:t xml:space="preserve">Yes</w:t>
+            </w:r>
+          </w:p>
+        </w:tc>
+      </w:tr>
+      <w:tr>
+        <w:trPr>
+          <w:cantSplit/>
+        </w:trPr>
+        <w:tc>
+          <w:tcPr>
+            <w:tcW w:type="dxa" w:w="2906"/>
+            <w:tcBorders>
+              <w:top w:val="single" w:color="000000" w:sz="4"/>
+              <w:left w:val="single" w:color="000000" w:sz="4"/>
+              <w:bottom w:val="single" w:color="000000" w:sz="4"/>
+              <w:right w:val="single" w:color="000000" w:sz="4"/>
+            </w:tcBorders>
+            <w:tcMar>
+              <w:top w:type="dxa" w:w="60"/>
+              <w:left w:type="dxa" w:w="100"/>
+              <w:bottom w:type="dxa" w:w="60"/>
+              <w:right w:type="dxa" w:w="100"/>
+            </w:tcMar>
+            <w:vAlign w:val="top"/>
+          </w:tcPr>
+          <w:p>
+            <w:pPr>
+              <w:spacing w:before="0" w:after="0"/>
+            </w:pPr>
+            <w:r>
+              <w:rPr>
+                <w:rFonts w:ascii="Arial" w:cs="Arial" w:eastAsia="Arial" w:hAnsi="Arial"/>
+                <w:sz w:val="20"/>
+                <w:szCs w:val="20"/>
+              </w:rPr>
+              <w:t xml:space="preserve">Administration</w:t>
+            </w:r>
+          </w:p>
+        </w:tc>
+        <w:tc>
+          <w:tcPr>
+            <w:tcW w:type="dxa" w:w="1400"/>
+            <w:tcBorders>
+              <w:top w:val="single" w:color="000000" w:sz="4"/>
+              <w:left w:val="single" w:color="000000" w:sz="4"/>
+              <w:bottom w:val="single" w:color="000000" w:sz="4"/>
+              <w:right w:val="single" w:color="000000" w:sz="4"/>
+            </w:tcBorders>
+            <w:tcMar>
+              <w:top w:type="dxa" w:w="60"/>
+              <w:left w:type="dxa" w:w="100"/>
+              <w:bottom w:type="dxa" w:w="60"/>
+              <w:right w:type="dxa" w:w="100"/>
+            </w:tcMar>
+            <w:vAlign w:val="top"/>
+          </w:tcPr>
+          <w:p>
+            <w:pPr>
+              <w:spacing w:before="0" w:after="0"/>
+            </w:pPr>
+            <w:r>
+              <w:rPr>
+                <w:rFonts w:ascii="Arial" w:cs="Arial" w:eastAsia="Arial" w:hAnsi="Arial"/>
+                <w:sz w:val="20"/>
+                <w:szCs w:val="20"/>
+              </w:rPr>
+              <w:t xml:space="preserve">Yes</w:t>
+            </w:r>
+          </w:p>
+        </w:tc>
+        <w:tc>
+          <w:tcPr>
+            <w:tcW w:type="dxa" w:w="1400"/>
+            <w:tcBorders>
+              <w:top w:val="single" w:color="000000" w:sz="4"/>
+              <w:left w:val="single" w:color="000000" w:sz="4"/>
+              <w:bottom w:val="single" w:color="000000" w:sz="4"/>
+              <w:right w:val="single" w:color="000000" w:sz="4"/>
+            </w:tcBorders>
+            <w:tcMar>
+              <w:top w:type="dxa" w:w="60"/>
+              <w:left w:type="dxa" w:w="100"/>
+              <w:bottom w:type="dxa" w:w="60"/>
+              <w:right w:type="dxa" w:w="100"/>
+            </w:tcMar>
+            <w:vAlign w:val="top"/>
+          </w:tcPr>
+          <w:p>
+            <w:pPr>
+              <w:spacing w:before="0" w:after="0"/>
+            </w:pPr>
+            <w:r>
+              <w:rPr>
+                <w:rFonts w:ascii="Arial" w:cs="Arial" w:eastAsia="Arial" w:hAnsi="Arial"/>
+                <w:sz w:val="20"/>
+                <w:szCs w:val="20"/>
+              </w:rPr>
+              <w:t xml:space="preserve">—</w:t>
+            </w:r>
+          </w:p>
+        </w:tc>
+        <w:tc>
+          <w:tcPr>
+            <w:tcW w:type="dxa" w:w="1400"/>
+            <w:tcBorders>
+              <w:top w:val="single" w:color="000000" w:sz="4"/>
+              <w:left w:val="single" w:color="000000" w:sz="4"/>
+              <w:bottom w:val="single" w:color="000000" w:sz="4"/>
+              <w:right w:val="single" w:color="000000" w:sz="4"/>
+            </w:tcBorders>
+            <w:tcMar>
+              <w:top w:type="dxa" w:w="60"/>
+              <w:left w:type="dxa" w:w="100"/>
+              <w:bottom w:type="dxa" w:w="60"/>
+              <w:right w:type="dxa" w:w="100"/>
+            </w:tcMar>
+            <w:vAlign w:val="top"/>
+          </w:tcPr>
+          <w:p>
+            <w:pPr>
+              <w:spacing w:before="0" w:after="0"/>
+            </w:pPr>
+            <w:r>
+              <w:rPr>
+                <w:rFonts w:ascii="Arial" w:cs="Arial" w:eastAsia="Arial" w:hAnsi="Arial"/>
+                <w:sz w:val="20"/>
+                <w:szCs w:val="20"/>
+              </w:rPr>
+              <w:t xml:space="preserve">—</w:t>
+            </w:r>
+          </w:p>
+        </w:tc>
+        <w:tc>
+          <w:tcPr>
+            <w:tcW w:type="dxa" w:w="1400"/>
+            <w:tcBorders>
+              <w:top w:val="single" w:color="000000" w:sz="4"/>
+              <w:left w:val="single" w:color="000000" w:sz="4"/>
+              <w:bottom w:val="single" w:color="000000" w:sz="4"/>
+              <w:right w:val="single" w:color="000000" w:sz="4"/>
+            </w:tcBorders>
+            <w:tcMar>
+              <w:top w:type="dxa" w:w="60"/>
+              <w:left w:type="dxa" w:w="100"/>
+              <w:bottom w:type="dxa" w:w="60"/>
+              <w:right w:type="dxa" w:w="100"/>
+            </w:tcMar>
+            <w:vAlign w:val="top"/>
+          </w:tcPr>
+          <w:p>
+            <w:pPr>
+              <w:spacing w:before="0" w:after="0"/>
+            </w:pPr>
+            <w:r>
+              <w:rPr>
+                <w:rFonts w:ascii="Arial" w:cs="Arial" w:eastAsia="Arial" w:hAnsi="Arial"/>
+                <w:sz w:val="20"/>
+                <w:szCs w:val="20"/>
+              </w:rPr>
+              <w:t xml:space="preserve">—</w:t>
+            </w:r>
+          </w:p>
+        </w:tc>
+        <w:tc>
+          <w:tcPr>
+            <w:tcW w:type="dxa" w:w="1400"/>
+            <w:tcBorders>
+              <w:top w:val="single" w:color="000000" w:sz="4"/>
+              <w:left w:val="single" w:color="000000" w:sz="4"/>
+              <w:bottom w:val="single" w:color="000000" w:sz="4"/>
+              <w:right w:val="single" w:color="000000" w:sz="4"/>
+            </w:tcBorders>
+            <w:tcMar>
+              <w:top w:type="dxa" w:w="60"/>
+              <w:left w:type="dxa" w:w="100"/>
+              <w:bottom w:type="dxa" w:w="60"/>
+              <w:right w:type="dxa" w:w="100"/>
+            </w:tcMar>
+            <w:vAlign w:val="top"/>
+          </w:tcPr>
+          <w:p>
+            <w:pPr>
+              <w:spacing w:before="0" w:after="0"/>
+            </w:pPr>
+            <w:r>
+              <w:rPr>
+                <w:rFonts w:ascii="Arial" w:cs="Arial" w:eastAsia="Arial" w:hAnsi="Arial"/>
+                <w:sz w:val="20"/>
+                <w:szCs w:val="20"/>
+              </w:rPr>
+              <w:t xml:space="preserve">—</w:t>
+            </w:r>
+          </w:p>
+        </w:tc>
+      </w:tr>
+      <w:tr>
+        <w:trPr>
+          <w:cantSplit/>
+        </w:trPr>
+        <w:tc>
+          <w:tcPr>
+            <w:tcW w:type="dxa" w:w="2906"/>
+            <w:tcBorders>
+              <w:top w:val="single" w:color="000000" w:sz="4"/>
+              <w:left w:val="single" w:color="000000" w:sz="4"/>
+              <w:bottom w:val="single" w:color="000000" w:sz="4"/>
+              <w:right w:val="single" w:color="000000" w:sz="4"/>
+            </w:tcBorders>
+            <w:tcMar>
+              <w:top w:type="dxa" w:w="60"/>
+              <w:left w:type="dxa" w:w="100"/>
+              <w:bottom w:type="dxa" w:w="60"/>
+              <w:right w:type="dxa" w:w="100"/>
+            </w:tcMar>
+            <w:vAlign w:val="top"/>
+          </w:tcPr>
+          <w:p>
+            <w:pPr>
+              <w:spacing w:before="0" w:after="0"/>
+            </w:pPr>
+            <w:r>
+              <w:rPr>
+                <w:rFonts w:ascii="Arial" w:cs="Arial" w:eastAsia="Arial" w:hAnsi="Arial"/>
+                <w:sz w:val="20"/>
+                <w:szCs w:val="20"/>
+              </w:rPr>
+              <w:t xml:space="preserve">Messages and voice calls</w:t>
+            </w:r>
+          </w:p>
+        </w:tc>
+        <w:tc>
+          <w:tcPr>
+            <w:tcW w:type="dxa" w:w="1400"/>
+            <w:tcBorders>
+              <w:top w:val="single" w:color="000000" w:sz="4"/>
+              <w:left w:val="single" w:color="000000" w:sz="4"/>
+              <w:bottom w:val="single" w:color="000000" w:sz="4"/>
+              <w:right w:val="single" w:color="000000" w:sz="4"/>
+            </w:tcBorders>
+            <w:tcMar>
+              <w:top w:type="dxa" w:w="60"/>
+              <w:left w:type="dxa" w:w="100"/>
+              <w:bottom w:type="dxa" w:w="60"/>
+              <w:right w:type="dxa" w:w="100"/>
+            </w:tcMar>
+            <w:vAlign w:val="top"/>
+          </w:tcPr>
+          <w:p>
+            <w:pPr>
+              <w:spacing w:before="0" w:after="0"/>
+            </w:pPr>
+            <w:r>
+              <w:rPr>
+                <w:rFonts w:ascii="Arial" w:cs="Arial" w:eastAsia="Arial" w:hAnsi="Arial"/>
+                <w:sz w:val="20"/>
+                <w:szCs w:val="20"/>
+              </w:rPr>
+              <w:t xml:space="preserve">Yes</w:t>
+            </w:r>
+          </w:p>
+        </w:tc>
+        <w:tc>
+          <w:tcPr>
+            <w:tcW w:type="dxa" w:w="1400"/>
+            <w:tcBorders>
+              <w:top w:val="single" w:color="000000" w:sz="4"/>
+              <w:left w:val="single" w:color="000000" w:sz="4"/>
+              <w:bottom w:val="single" w:color="000000" w:sz="4"/>
+              <w:right w:val="single" w:color="000000" w:sz="4"/>
+            </w:tcBorders>
+            <w:tcMar>
+              <w:top w:type="dxa" w:w="60"/>
+              <w:left w:type="dxa" w:w="100"/>
+              <w:bottom w:type="dxa" w:w="60"/>
+              <w:right w:type="dxa" w:w="100"/>
+            </w:tcMar>
+            <w:vAlign w:val="top"/>
+          </w:tcPr>
+          <w:p>
+            <w:pPr>
+              <w:spacing w:before="0" w:after="0"/>
+            </w:pPr>
+            <w:r>
+              <w:rPr>
+                <w:rFonts w:ascii="Arial" w:cs="Arial" w:eastAsia="Arial" w:hAnsi="Arial"/>
+                <w:sz w:val="20"/>
+                <w:szCs w:val="20"/>
+              </w:rPr>
+              <w:t xml:space="preserve">Yes</w:t>
+            </w:r>
+          </w:p>
+        </w:tc>
+        <w:tc>
+          <w:tcPr>
+            <w:tcW w:type="dxa" w:w="1400"/>
+            <w:tcBorders>
+              <w:top w:val="single" w:color="000000" w:sz="4"/>
+              <w:left w:val="single" w:color="000000" w:sz="4"/>
+              <w:bottom w:val="single" w:color="000000" w:sz="4"/>
+              <w:right w:val="single" w:color="000000" w:sz="4"/>
+            </w:tcBorders>
+            <w:tcMar>
+              <w:top w:type="dxa" w:w="60"/>
+              <w:left w:type="dxa" w:w="100"/>
+              <w:bottom w:type="dxa" w:w="60"/>
+              <w:right w:type="dxa" w:w="100"/>
+            </w:tcMar>
+            <w:vAlign w:val="top"/>
+          </w:tcPr>
+          <w:p>
+            <w:pPr>
+              <w:spacing w:before="0" w:after="0"/>
+            </w:pPr>
+            <w:r>
+              <w:rPr>
+                <w:rFonts w:ascii="Arial" w:cs="Arial" w:eastAsia="Arial" w:hAnsi="Arial"/>
+                <w:sz w:val="20"/>
+                <w:szCs w:val="20"/>
+              </w:rPr>
+              <w:t xml:space="preserve">Yes</w:t>
+            </w:r>
+          </w:p>
+        </w:tc>
+        <w:tc>
+          <w:tcPr>
+            <w:tcW w:type="dxa" w:w="1400"/>
+            <w:tcBorders>
+              <w:top w:val="single" w:color="000000" w:sz="4"/>
+              <w:left w:val="single" w:color="000000" w:sz="4"/>
+              <w:bottom w:val="single" w:color="000000" w:sz="4"/>
+              <w:right w:val="single" w:color="000000" w:sz="4"/>
+            </w:tcBorders>
+            <w:tcMar>
+              <w:top w:type="dxa" w:w="60"/>
+              <w:left w:type="dxa" w:w="100"/>
+              <w:bottom w:type="dxa" w:w="60"/>
+              <w:right w:type="dxa" w:w="100"/>
+            </w:tcMar>
+            <w:vAlign w:val="top"/>
+          </w:tcPr>
+          <w:p>
+            <w:pPr>
+              <w:spacing w:before="0" w:after="0"/>
+            </w:pPr>
+            <w:r>
+              <w:rPr>
+                <w:rFonts w:ascii="Arial" w:cs="Arial" w:eastAsia="Arial" w:hAnsi="Arial"/>
+                <w:sz w:val="20"/>
+                <w:szCs w:val="20"/>
+              </w:rPr>
+              <w:t xml:space="preserve">Yes</w:t>
+            </w:r>
+          </w:p>
+        </w:tc>
+        <w:tc>
+          <w:tcPr>
+            <w:tcW w:type="dxa" w:w="1400"/>
+            <w:tcBorders>
+              <w:top w:val="single" w:color="000000" w:sz="4"/>
+              <w:left w:val="single" w:color="000000" w:sz="4"/>
+              <w:bottom w:val="single" w:color="000000" w:sz="4"/>
+              <w:right w:val="single" w:color="000000" w:sz="4"/>
+            </w:tcBorders>
+            <w:tcMar>
+              <w:top w:type="dxa" w:w="60"/>
+              <w:left w:type="dxa" w:w="100"/>
+              <w:bottom w:type="dxa" w:w="60"/>
+              <w:right w:type="dxa" w:w="100"/>
+            </w:tcMar>
+            <w:vAlign w:val="top"/>
+          </w:tcPr>
+          <w:p>
+            <w:pPr>
+              <w:spacing w:before="0" w:after="0"/>
+            </w:pPr>
+            <w:r>
+              <w:rPr>
+                <w:rFonts w:ascii="Arial" w:cs="Arial" w:eastAsia="Arial" w:hAnsi="Arial"/>
+                <w:sz w:val="20"/>
+                <w:szCs w:val="20"/>
+              </w:rPr>
+              <w:t xml:space="preserve">Yes</w:t>
+            </w:r>
+          </w:p>
+        </w:tc>
+      </w:tr>
+      <w:tr>
+        <w:trPr>
+          <w:cantSplit/>
+        </w:trPr>
+        <w:tc>
+          <w:tcPr>
+            <w:tcW w:type="dxa" w:w="2906"/>
+            <w:tcBorders>
+              <w:top w:val="single" w:color="000000" w:sz="4"/>
+              <w:left w:val="single" w:color="000000" w:sz="4"/>
+              <w:bottom w:val="single" w:color="000000" w:sz="4"/>
+              <w:right w:val="single" w:color="000000" w:sz="4"/>
+            </w:tcBorders>
+            <w:tcMar>
+              <w:top w:type="dxa" w:w="60"/>
+              <w:left w:type="dxa" w:w="100"/>
+              <w:bottom w:type="dxa" w:w="60"/>
+              <w:right w:type="dxa" w:w="100"/>
+            </w:tcMar>
+            <w:vAlign w:val="top"/>
+          </w:tcPr>
+          <w:p>
+            <w:pPr>
+              <w:spacing w:before="0" w:after="0"/>
+            </w:pPr>
+            <w:r>
+              <w:rPr>
+                <w:rFonts w:ascii="Arial" w:cs="Arial" w:eastAsia="Arial" w:hAnsi="Arial"/>
+                <w:sz w:val="20"/>
+                <w:szCs w:val="20"/>
+              </w:rPr>
+              <w:t xml:space="preserve">Raise flash alerts</w:t>
+            </w:r>
+          </w:p>
+        </w:tc>
+        <w:tc>
+          <w:tcPr>
+            <w:tcW w:type="dxa" w:w="1400"/>
+            <w:tcBorders>
+              <w:top w:val="single" w:color="000000" w:sz="4"/>
+              <w:left w:val="single" w:color="000000" w:sz="4"/>
+              <w:bottom w:val="single" w:color="000000" w:sz="4"/>
+              <w:right w:val="single" w:color="000000" w:sz="4"/>
+            </w:tcBorders>
+            <w:tcMar>
+              <w:top w:type="dxa" w:w="60"/>
+              <w:left w:type="dxa" w:w="100"/>
+              <w:bottom w:type="dxa" w:w="60"/>
+              <w:right w:type="dxa" w:w="100"/>
+            </w:tcMar>
+            <w:vAlign w:val="top"/>
+          </w:tcPr>
+          <w:p>
+            <w:pPr>
+              <w:spacing w:before="0" w:after="0"/>
+            </w:pPr>
+            <w:r>
+              <w:rPr>
+                <w:rFonts w:ascii="Arial" w:cs="Arial" w:eastAsia="Arial" w:hAnsi="Arial"/>
+                <w:sz w:val="20"/>
+                <w:szCs w:val="20"/>
+              </w:rPr>
+              <w:t xml:space="preserve">Yes</w:t>
+            </w:r>
+          </w:p>
+        </w:tc>
+        <w:tc>
+          <w:tcPr>
+            <w:tcW w:type="dxa" w:w="1400"/>
+            <w:tcBorders>
+              <w:top w:val="single" w:color="000000" w:sz="4"/>
+              <w:left w:val="single" w:color="000000" w:sz="4"/>
+              <w:bottom w:val="single" w:color="000000" w:sz="4"/>
+              <w:right w:val="single" w:color="000000" w:sz="4"/>
+            </w:tcBorders>
+            <w:tcMar>
+              <w:top w:type="dxa" w:w="60"/>
+              <w:left w:type="dxa" w:w="100"/>
+              <w:bottom w:type="dxa" w:w="60"/>
+              <w:right w:type="dxa" w:w="100"/>
+            </w:tcMar>
+            <w:vAlign w:val="top"/>
+          </w:tcPr>
+          <w:p>
+            <w:pPr>
+              <w:spacing w:before="0" w:after="0"/>
+            </w:pPr>
+            <w:r>
+              <w:rPr>
+                <w:rFonts w:ascii="Arial" w:cs="Arial" w:eastAsia="Arial" w:hAnsi="Arial"/>
+                <w:sz w:val="20"/>
+                <w:szCs w:val="20"/>
+              </w:rPr>
+              <w:t xml:space="preserve">Yes</w:t>
+            </w:r>
+          </w:p>
+        </w:tc>
+        <w:tc>
+          <w:tcPr>
+            <w:tcW w:type="dxa" w:w="1400"/>
+            <w:tcBorders>
+              <w:top w:val="single" w:color="000000" w:sz="4"/>
+              <w:left w:val="single" w:color="000000" w:sz="4"/>
+              <w:bottom w:val="single" w:color="000000" w:sz="4"/>
+              <w:right w:val="single" w:color="000000" w:sz="4"/>
+            </w:tcBorders>
+            <w:tcMar>
+              <w:top w:type="dxa" w:w="60"/>
+              <w:left w:type="dxa" w:w="100"/>
+              <w:bottom w:type="dxa" w:w="60"/>
+              <w:right w:type="dxa" w:w="100"/>
+            </w:tcMar>
+            <w:vAlign w:val="top"/>
+          </w:tcPr>
+          <w:p>
+            <w:pPr>
+              <w:spacing w:before="0" w:after="0"/>
+            </w:pPr>
+            <w:r>
+              <w:rPr>
+                <w:rFonts w:ascii="Arial" w:cs="Arial" w:eastAsia="Arial" w:hAnsi="Arial"/>
+                <w:sz w:val="20"/>
+                <w:szCs w:val="20"/>
+              </w:rPr>
+              <w:t xml:space="preserve">—</w:t>
+            </w:r>
+          </w:p>
+        </w:tc>
+        <w:tc>
+          <w:tcPr>
+            <w:tcW w:type="dxa" w:w="1400"/>
+            <w:tcBorders>
+              <w:top w:val="single" w:color="000000" w:sz="4"/>
+              <w:left w:val="single" w:color="000000" w:sz="4"/>
+              <w:bottom w:val="single" w:color="000000" w:sz="4"/>
+              <w:right w:val="single" w:color="000000" w:sz="4"/>
+            </w:tcBorders>
+            <w:tcMar>
+              <w:top w:type="dxa" w:w="60"/>
+              <w:left w:type="dxa" w:w="100"/>
+              <w:bottom w:type="dxa" w:w="60"/>
+              <w:right w:type="dxa" w:w="100"/>
+            </w:tcMar>
+            <w:vAlign w:val="top"/>
+          </w:tcPr>
+          <w:p>
+            <w:pPr>
+              <w:spacing w:before="0" w:after="0"/>
+            </w:pPr>
+            <w:r>
+              <w:rPr>
+                <w:rFonts w:ascii="Arial" w:cs="Arial" w:eastAsia="Arial" w:hAnsi="Arial"/>
+                <w:sz w:val="20"/>
+                <w:szCs w:val="20"/>
+              </w:rPr>
+              <w:t xml:space="preserve">—</w:t>
+            </w:r>
+          </w:p>
+        </w:tc>
+        <w:tc>
+          <w:tcPr>
+            <w:tcW w:type="dxa" w:w="1400"/>
+            <w:tcBorders>
+              <w:top w:val="single" w:color="000000" w:sz="4"/>
+              <w:left w:val="single" w:color="000000" w:sz="4"/>
+              <w:bottom w:val="single" w:color="000000" w:sz="4"/>
+              <w:right w:val="single" w:color="000000" w:sz="4"/>
+            </w:tcBorders>
+            <w:tcMar>
+              <w:top w:type="dxa" w:w="60"/>
+              <w:left w:type="dxa" w:w="100"/>
+              <w:bottom w:type="dxa" w:w="60"/>
+              <w:right w:type="dxa" w:w="100"/>
+            </w:tcMar>
+            <w:vAlign w:val="top"/>
+          </w:tcPr>
+          <w:p>
+            <w:pPr>
+              <w:spacing w:before="0" w:after="0"/>
+            </w:pPr>
+            <w:r>
+              <w:rPr>
+                <w:rFonts w:ascii="Arial" w:cs="Arial" w:eastAsia="Arial" w:hAnsi="Arial"/>
+                <w:sz w:val="20"/>
+                <w:szCs w:val="20"/>
+              </w:rPr>
+              <w:t xml:space="preserve">—</w:t>
+            </w:r>
+          </w:p>
+        </w:tc>
+      </w:tr>
+      <w:tr>
+        <w:trPr>
+          <w:cantSplit/>
+        </w:trPr>
+        <w:tc>
+          <w:tcPr>
+            <w:tcW w:type="dxa" w:w="2906"/>
+            <w:tcBorders>
+              <w:top w:val="single" w:color="000000" w:sz="4"/>
+              <w:left w:val="single" w:color="000000" w:sz="4"/>
+              <w:bottom w:val="single" w:color="000000" w:sz="4"/>
+              <w:right w:val="single" w:color="000000" w:sz="4"/>
+            </w:tcBorders>
+            <w:tcMar>
+              <w:top w:type="dxa" w:w="60"/>
+              <w:left w:type="dxa" w:w="100"/>
+              <w:bottom w:type="dxa" w:w="60"/>
+              <w:right w:type="dxa" w:w="100"/>
+            </w:tcMar>
+            <w:vAlign w:val="top"/>
+          </w:tcPr>
+          <w:p>
+            <w:pPr>
+              <w:spacing w:before="0" w:after="0"/>
+            </w:pPr>
+            <w:r>
+              <w:rPr>
+                <w:rFonts w:ascii="Arial" w:cs="Arial" w:eastAsia="Arial" w:hAnsi="Arial"/>
+                <w:sz w:val="20"/>
+                <w:szCs w:val="20"/>
+              </w:rPr>
+              <w:t xml:space="preserve">Workflow actions</w:t>
+            </w:r>
+          </w:p>
+        </w:tc>
+        <w:tc>
+          <w:tcPr>
+            <w:tcW w:type="dxa" w:w="1400"/>
+            <w:tcBorders>
+              <w:top w:val="single" w:color="000000" w:sz="4"/>
+              <w:left w:val="single" w:color="000000" w:sz="4"/>
+              <w:bottom w:val="single" w:color="000000" w:sz="4"/>
+              <w:right w:val="single" w:color="000000" w:sz="4"/>
+            </w:tcBorders>
+            <w:tcMar>
+              <w:top w:type="dxa" w:w="60"/>
+              <w:left w:type="dxa" w:w="100"/>
+              <w:bottom w:type="dxa" w:w="60"/>
+              <w:right w:type="dxa" w:w="100"/>
+            </w:tcMar>
+            <w:vAlign w:val="top"/>
+          </w:tcPr>
+          <w:p>
+            <w:pPr>
+              <w:spacing w:before="0" w:after="0"/>
+            </w:pPr>
+            <w:r>
+              <w:rPr>
+                <w:rFonts w:ascii="Arial" w:cs="Arial" w:eastAsia="Arial" w:hAnsi="Arial"/>
+                <w:sz w:val="20"/>
+                <w:szCs w:val="20"/>
+              </w:rPr>
+              <w:t xml:space="preserve">Review, verify, approve, close, return, reject</w:t>
+            </w:r>
+          </w:p>
+        </w:tc>
+        <w:tc>
+          <w:tcPr>
+            <w:tcW w:type="dxa" w:w="1400"/>
+            <w:tcBorders>
+              <w:top w:val="single" w:color="000000" w:sz="4"/>
+              <w:left w:val="single" w:color="000000" w:sz="4"/>
+              <w:bottom w:val="single" w:color="000000" w:sz="4"/>
+              <w:right w:val="single" w:color="000000" w:sz="4"/>
+            </w:tcBorders>
+            <w:tcMar>
+              <w:top w:type="dxa" w:w="60"/>
+              <w:left w:type="dxa" w:w="100"/>
+              <w:bottom w:type="dxa" w:w="60"/>
+              <w:right w:type="dxa" w:w="100"/>
+            </w:tcMar>
+            <w:vAlign w:val="top"/>
+          </w:tcPr>
+          <w:p>
+            <w:pPr>
+              <w:spacing w:before="0" w:after="0"/>
+            </w:pPr>
+            <w:r>
+              <w:rPr>
+                <w:rFonts w:ascii="Arial" w:cs="Arial" w:eastAsia="Arial" w:hAnsi="Arial"/>
+                <w:sz w:val="20"/>
+                <w:szCs w:val="20"/>
+              </w:rPr>
+              <w:t xml:space="preserve">Review, return, reject</w:t>
+            </w:r>
+          </w:p>
+        </w:tc>
+        <w:tc>
+          <w:tcPr>
+            <w:tcW w:type="dxa" w:w="1400"/>
+            <w:tcBorders>
+              <w:top w:val="single" w:color="000000" w:sz="4"/>
+              <w:left w:val="single" w:color="000000" w:sz="4"/>
+              <w:bottom w:val="single" w:color="000000" w:sz="4"/>
+              <w:right w:val="single" w:color="000000" w:sz="4"/>
+            </w:tcBorders>
+            <w:tcMar>
+              <w:top w:type="dxa" w:w="60"/>
+              <w:left w:type="dxa" w:w="100"/>
+              <w:bottom w:type="dxa" w:w="60"/>
+              <w:right w:type="dxa" w:w="100"/>
+            </w:tcMar>
+            <w:vAlign w:val="top"/>
+          </w:tcPr>
+          <w:p>
+            <w:pPr>
+              <w:spacing w:before="0" w:after="0"/>
+            </w:pPr>
+            <w:r>
+              <w:rPr>
+                <w:rFonts w:ascii="Arial" w:cs="Arial" w:eastAsia="Arial" w:hAnsi="Arial"/>
+                <w:sz w:val="20"/>
+                <w:szCs w:val="20"/>
+              </w:rPr>
+              <w:t xml:space="preserve">Submit own reports</w:t>
+            </w:r>
+          </w:p>
+        </w:tc>
+        <w:tc>
+          <w:tcPr>
+            <w:tcW w:type="dxa" w:w="1400"/>
+            <w:tcBorders>
+              <w:top w:val="single" w:color="000000" w:sz="4"/>
+              <w:left w:val="single" w:color="000000" w:sz="4"/>
+              <w:bottom w:val="single" w:color="000000" w:sz="4"/>
+              <w:right w:val="single" w:color="000000" w:sz="4"/>
+            </w:tcBorders>
+            <w:tcMar>
+              <w:top w:type="dxa" w:w="60"/>
+              <w:left w:type="dxa" w:w="100"/>
+              <w:bottom w:type="dxa" w:w="60"/>
+              <w:right w:type="dxa" w:w="100"/>
+            </w:tcMar>
+            <w:vAlign w:val="top"/>
+          </w:tcPr>
+          <w:p>
+            <w:pPr>
+              <w:spacing w:before="0" w:after="0"/>
+            </w:pPr>
+            <w:r>
+              <w:rPr>
+                <w:rFonts w:ascii="Arial" w:cs="Arial" w:eastAsia="Arial" w:hAnsi="Arial"/>
+                <w:sz w:val="20"/>
+                <w:szCs w:val="20"/>
+              </w:rPr>
+              <w:t xml:space="preserve">Review, verify, approve, return, reject</w:t>
+            </w:r>
+          </w:p>
+        </w:tc>
+        <w:tc>
+          <w:tcPr>
+            <w:tcW w:type="dxa" w:w="1400"/>
+            <w:tcBorders>
+              <w:top w:val="single" w:color="000000" w:sz="4"/>
+              <w:left w:val="single" w:color="000000" w:sz="4"/>
+              <w:bottom w:val="single" w:color="000000" w:sz="4"/>
+              <w:right w:val="single" w:color="000000" w:sz="4"/>
+            </w:tcBorders>
+            <w:tcMar>
+              <w:top w:type="dxa" w:w="60"/>
+              <w:left w:type="dxa" w:w="100"/>
+              <w:bottom w:type="dxa" w:w="60"/>
+              <w:right w:type="dxa" w:w="100"/>
+            </w:tcMar>
+            <w:vAlign w:val="top"/>
+          </w:tcPr>
+          <w:p>
+            <w:pPr>
+              <w:spacing w:before="0" w:after="0"/>
+            </w:pPr>
+            <w:r>
+              <w:rPr>
+                <w:rFonts w:ascii="Arial" w:cs="Arial" w:eastAsia="Arial" w:hAnsi="Arial"/>
+                <w:sz w:val="20"/>
+                <w:szCs w:val="20"/>
+              </w:rPr>
+              <w:t xml:space="preserve">None (read only)</w:t>
+            </w:r>
+          </w:p>
+        </w:tc>
+      </w:tr>
+    </w:tbl>
+    <w:p>
+      <w:pPr>
+        <w:spacing w:before="0" w:after="120"/>
+      </w:pPr>
+      <w:r>
+        <w:rPr>
+          <w:rFonts w:ascii="Arial" w:cs="Arial" w:eastAsia="Arial" w:hAnsi="Arial"/>
+          <w:sz w:val="20"/>
+          <w:szCs w:val="20"/>
+        </w:rPr>
+        <w:t xml:space="preserve"/>
+      </w:r>
+    </w:p>
+    <w:p>
+      <w:pPr>
+        <w:spacing w:before="0" w:after="120"/>
+        <w:jc w:val="both"/>
+      </w:pPr>
+      <w:r>
+        <w:rPr>
+          <w:rFonts w:ascii="Arial" w:cs="Arial" w:eastAsia="Arial" w:hAnsi="Arial"/>
+          <w:sz w:val="20"/>
+          <w:szCs w:val="20"/>
+        </w:rPr>
+        <w:t xml:space="preserve">Each user is assigned a scope: HQ (every unit), a sector, a battalion or a BOP. Lists, the map, dashboards, analytics, reports, exports and workflow actions include only the incidents within that scope, and a user who is not permitted a record receives "not found" rather than its contents. The hierarchy HQ → Sector → Battalion → BOP is maintained in Administration › Organisation. Separately from scope, nobody can review, verify or approve a report they filed themselves.</w:t>
+      </w:r>
+    </w:p>
+    <w:p>
+      <w:pPr>
+        <w:pStyle w:val="Heading2"/>
+        <w:keepNext/>
+        <w:spacing w:before="200" w:after="100"/>
+      </w:pPr>
+      <w:r>
+        <w:rPr>
+          <w:rFonts w:ascii="Arial" w:cs="Arial" w:eastAsia="Arial" w:hAnsi="Arial"/>
+          <w:b/>
+          <w:bCs/>
+          <w:color w:val="000000"/>
+          <w:sz w:val="22"/>
+          <w:szCs w:val="22"/>
+        </w:rPr>
+        <w:t xml:space="preserve">4.3  Evidence handling</w:t>
+      </w:r>
+    </w:p>
+    <w:p>
+      <w:pPr>
+        <w:spacing w:before="0" w:after="120"/>
+        <w:jc w:val="both"/>
+      </w:pPr>
+      <w:r>
+        <w:rPr>
+          <w:rFonts w:ascii="Arial" w:cs="Arial" w:eastAsia="Arial" w:hAnsi="Arial"/>
+          <w:sz w:val="20"/>
+          <w:szCs w:val="20"/>
+        </w:rPr>
+        <w:t xml:space="preserve">Evidence files pass through the steps below before they are stored, and are checked again every time they are opened (items 10, 11, 25, 33). The original metadata is kept with the record, so the evidential value of photographs and documents is preserved.</w:t>
+      </w:r>
+    </w:p>
+    <w:p>
+      <w:pPr>
+        <w:keepNext/>
+        <w:spacing w:before="120" w:after="60"/>
+        <w:jc w:val="center"/>
+      </w:pPr>
+      <w:r>
+        <w:drawing>
+          <wp:inline distT="0" distB="0" distL="0" distR="0">
+            <wp:extent cx="5657850" cy="3228975"/>
+            <wp:effectExtent t="0" r="0" b="0" l="0"/>
+            <wp:docPr id="1" name="" descr="" title=""/>
+            <wp:cNvGraphicFramePr>
+              <a:graphicFrameLocks xmlns:a="http://schemas.openxmlformats.org/drawingml/2006/main" noChangeAspect="1"/>
+            </wp:cNvGraphicFramePr>
+            <a:graphic xmlns:a="http://schemas.openxmlformats.org/drawingml/2006/main">
+              <a:graphicData uri="http://schemas.openxmlformats.org/drawingml/2006/picture">
+                <pic:pic xmlns:pic="http://schemas.openxmlformats.org/drawingml/2006/picture">
+                  <pic:nvPicPr>
+                    <pic:cNvPr id="0" name="" descr=""/>
+                    <pic:cNvPicPr>
+                      <a:picLocks noChangeAspect="1" noChangeArrowheads="1"/>
+                    </pic:cNvPicPr>
+                  </pic:nvPicPr>
+                  <pic:blipFill>
+                    <a:blip r:embed="rId9" cstate="none"/>
+                    <a:srcRect/>
+                    <a:stretch>
+                      <a:fillRect/>
+                    </a:stretch>
+                  </pic:blipFill>
+                  <pic:spPr bwMode="auto">
+                    <a:xfrm>
+                      <a:off x="0" y="0"/>
+                      <a:ext cx="5657850" cy="3228975"/>
+                    </a:xfrm>
+                    <a:prstGeom prst="rect">
+                      <a:avLst/>
+                    </a:prstGeom>
+                  </pic:spPr>
+                </pic:pic>
+              </a:graphicData>
+            </a:graphic>
+          </wp:inline>
+        </w:drawing>
+      </w:r>
+    </w:p>
+    <w:p>
+      <w:pPr>
+        <w:spacing w:before="0" w:after="200"/>
+        <w:jc w:val="center"/>
+      </w:pPr>
+      <w:r>
+        <w:rPr>
+          <w:rFonts w:ascii="Arial" w:cs="Arial" w:eastAsia="Arial" w:hAnsi="Arial"/>
+          <w:b/>
+          <w:bCs/>
+          <w:sz w:val="18"/>
+          <w:szCs w:val="18"/>
+        </w:rPr>
+        <w:t xml:space="preserve">Figure 2. </w:t>
+      </w:r>
+      <w:r>
+        <w:rPr>
+          <w:rFonts w:ascii="Arial" w:cs="Arial" w:eastAsia="Arial" w:hAnsi="Arial"/>
+          <w:sz w:val="18"/>
+          <w:szCs w:val="18"/>
+        </w:rPr>
+        <w:t xml:space="preserve">Evidence upload and retrieval with integrity checks (items 10, 11, 25, 33)</w:t>
+      </w:r>
+    </w:p>
+    <w:p>
+      <w:pPr>
         <w:pStyle w:val="Heading1"/>
         <w:keepNext/>
         <w:spacing w:before="300" w:after="120"/>
@@ -2654,6 +5251,77 @@
     </w:p>
     <w:p>
       <w:pPr>
+        <w:keepNext/>
+        <w:spacing w:before="120" w:after="60"/>
+        <w:jc w:val="center"/>
+      </w:pPr>
+      <w:r>
+        <w:drawing>
+          <wp:inline distT="0" distB="0" distL="0" distR="0">
+            <wp:extent cx="6286500" cy="4648200"/>
+            <wp:effectExtent t="0" r="0" b="0" l="0"/>
+            <wp:docPr id="1" name="" descr="" title=""/>
+            <wp:cNvGraphicFramePr>
+              <a:graphicFrameLocks xmlns:a="http://schemas.openxmlformats.org/drawingml/2006/main" noChangeAspect="1"/>
+            </wp:cNvGraphicFramePr>
+            <a:graphic xmlns:a="http://schemas.openxmlformats.org/drawingml/2006/main">
+              <a:graphicData uri="http://schemas.openxmlformats.org/drawingml/2006/picture">
+                <pic:pic xmlns:pic="http://schemas.openxmlformats.org/drawingml/2006/picture">
+                  <pic:nvPicPr>
+                    <pic:cNvPr id="0" name="" descr=""/>
+                    <pic:cNvPicPr>
+                      <a:picLocks noChangeAspect="1" noChangeArrowheads="1"/>
+                    </pic:cNvPicPr>
+                  </pic:nvPicPr>
+                  <pic:blipFill>
+                    <a:blip r:embed="rId10" cstate="none"/>
+                    <a:srcRect/>
+                    <a:stretch>
+                      <a:fillRect/>
+                    </a:stretch>
+                  </pic:blipFill>
+                  <pic:spPr bwMode="auto">
+                    <a:xfrm>
+                      <a:off x="0" y="0"/>
+                      <a:ext cx="6286500" cy="4648200"/>
+                    </a:xfrm>
+                    <a:prstGeom prst="rect">
+                      <a:avLst/>
+                    </a:prstGeom>
+                  </pic:spPr>
+                </pic:pic>
+              </a:graphicData>
+            </a:graphic>
+          </wp:inline>
+        </w:drawing>
+      </w:r>
+    </w:p>
+    <w:p>
+      <w:pPr>
+        <w:spacing w:before="0" w:after="200"/>
+        <w:jc w:val="center"/>
+      </w:pPr>
+      <w:r>
+        <w:rPr>
+          <w:rFonts w:ascii="Arial" w:cs="Arial" w:eastAsia="Arial" w:hAnsi="Arial"/>
+          <w:b/>
+          <w:bCs/>
+          <w:sz w:val="18"/>
+          <w:szCs w:val="18"/>
+        </w:rPr>
+        <w:t xml:space="preserve">Figure 3. </w:t>
+      </w:r>
+      <w:r>
+        <w:rPr>
+          <w:rFonts w:ascii="Arial" w:cs="Arial" w:eastAsia="Arial" w:hAnsi="Arial"/>
+          <w:sz w:val="18"/>
+          <w:szCs w:val="18"/>
+        </w:rPr>
+        <w:t xml:space="preserve">Solution architecture: three tiers, application modules and integrations (items 2, 30, 31, 58)</w:t>
+      </w:r>
+    </w:p>
+    <w:p>
+      <w:pPr>
         <w:pStyle w:val="Heading2"/>
         <w:keepNext/>
         <w:spacing w:before="200" w:after="100"/>
@@ -2903,7 +5571,7 @@
                 <w:sz w:val="20"/>
                 <w:szCs w:val="20"/>
               </w:rPr>
-              <w:t xml:space="preserve">BIRDS API and web application, run under a process manager (PM2) using all CPU cores</w:t>
+              <w:t xml:space="preserve">BIRDS API and web application, run under a process manager (PM2) using all CPU cores; they also hold the offline map data (section 7)</w:t>
             </w:r>
           </w:p>
         </w:tc>
@@ -3171,7 +5839,7 @@
                 <w:sz w:val="20"/>
                 <w:szCs w:val="20"/>
               </w:rPr>
-              <w:t xml:space="preserve">SMTP relay (e-mail notifications), TURN relay (voice calls), map-tile server (offline GIS), antivirus engine for uploads</w:t>
+              <w:t xml:space="preserve">SMTP relay (e-mail notifications), TURN relay (voice calls), antivirus engine for uploads</w:t>
             </w:r>
           </w:p>
         </w:tc>
@@ -3255,6 +5923,77 @@
           <w:szCs w:val="20"/>
         </w:rPr>
         <w:t xml:space="preserve"/>
+      </w:r>
+    </w:p>
+    <w:p>
+      <w:pPr>
+        <w:keepNext/>
+        <w:spacing w:before="120" w:after="60"/>
+        <w:jc w:val="center"/>
+      </w:pPr>
+      <w:r>
+        <w:drawing>
+          <wp:inline distT="0" distB="0" distL="0" distR="0">
+            <wp:extent cx="6286500" cy="4810125"/>
+            <wp:effectExtent t="0" r="0" b="0" l="0"/>
+            <wp:docPr id="1" name="" descr="" title=""/>
+            <wp:cNvGraphicFramePr>
+              <a:graphicFrameLocks xmlns:a="http://schemas.openxmlformats.org/drawingml/2006/main" noChangeAspect="1"/>
+            </wp:cNvGraphicFramePr>
+            <a:graphic xmlns:a="http://schemas.openxmlformats.org/drawingml/2006/main">
+              <a:graphicData uri="http://schemas.openxmlformats.org/drawingml/2006/picture">
+                <pic:pic xmlns:pic="http://schemas.openxmlformats.org/drawingml/2006/picture">
+                  <pic:nvPicPr>
+                    <pic:cNvPr id="0" name="" descr=""/>
+                    <pic:cNvPicPr>
+                      <a:picLocks noChangeAspect="1" noChangeArrowheads="1"/>
+                    </pic:cNvPicPr>
+                  </pic:nvPicPr>
+                  <pic:blipFill>
+                    <a:blip r:embed="rId11" cstate="none"/>
+                    <a:srcRect/>
+                    <a:stretch>
+                      <a:fillRect/>
+                    </a:stretch>
+                  </pic:blipFill>
+                  <pic:spPr bwMode="auto">
+                    <a:xfrm>
+                      <a:off x="0" y="0"/>
+                      <a:ext cx="6286500" cy="4810125"/>
+                    </a:xfrm>
+                    <a:prstGeom prst="rect">
+                      <a:avLst/>
+                    </a:prstGeom>
+                  </pic:spPr>
+                </pic:pic>
+              </a:graphicData>
+            </a:graphic>
+          </wp:inline>
+        </w:drawing>
+      </w:r>
+    </w:p>
+    <w:p>
+      <w:pPr>
+        <w:spacing w:before="0" w:after="200"/>
+        <w:jc w:val="center"/>
+      </w:pPr>
+      <w:r>
+        <w:rPr>
+          <w:rFonts w:ascii="Arial" w:cs="Arial" w:eastAsia="Arial" w:hAnsi="Arial"/>
+          <w:b/>
+          <w:bCs/>
+          <w:sz w:val="18"/>
+          <w:szCs w:val="18"/>
+        </w:rPr>
+        <w:t xml:space="preserve">Figure 4. </w:t>
+      </w:r>
+      <w:r>
+        <w:rPr>
+          <w:rFonts w:ascii="Arial" w:cs="Arial" w:eastAsia="Arial" w:hAnsi="Arial"/>
+          <w:sz w:val="18"/>
+          <w:szCs w:val="18"/>
+        </w:rPr>
+        <w:t xml:space="preserve">Deployment on BGB's network: main data centre and disaster-recovery site (items 27, 35, 36, 37); sizing in section 7</w:t>
       </w:r>
     </w:p>
     <w:p>
@@ -3829,6 +6568,249 @@
     </w:p>
     <w:p>
       <w:pPr>
+        <w:pStyle w:val="Heading2"/>
+        <w:keepNext/>
+        <w:spacing w:before="200" w:after="100"/>
+      </w:pPr>
+      <w:r>
+        <w:rPr>
+          <w:rFonts w:ascii="Arial" w:cs="Arial" w:eastAsia="Arial" w:hAnsi="Arial"/>
+          <w:b/>
+          <w:bCs/>
+          <w:color w:val="000000"/>
+          <w:sz w:val="22"/>
+          <w:szCs w:val="22"/>
+        </w:rPr>
+        <w:t xml:space="preserve">5.5  Database design</w:t>
+      </w:r>
+    </w:p>
+    <w:p>
+      <w:pPr>
+        <w:spacing w:before="0" w:after="120"/>
+        <w:jc w:val="both"/>
+      </w:pPr>
+      <w:r>
+        <w:rPr>
+          <w:rFonts w:ascii="Arial" w:cs="Arial" w:eastAsia="Arial" w:hAnsi="Arial"/>
+          <w:sz w:val="20"/>
+          <w:szCs w:val="20"/>
+        </w:rPr>
+        <w:t xml:space="preserve">BIRDS uses PostgreSQL, an enterprise relational database (item 30), with 25 tables. The schema is managed as versioned migrations, so every installation has exactly the same structure and upgrades are repeatable. Figures 5 and 6 show the tables and their relationships; to keep them readable, the many columns that refer to a user are marked "→ users" instead of being drawn as lines. The full table and column dictionary is part of the Database Documentation (section 14).</w:t>
+      </w:r>
+    </w:p>
+    <w:p>
+      <w:pPr>
+        <w:spacing w:before="0" w:after="80"/>
+        <w:ind w:left="400" w:hanging="400"/>
+        <w:jc w:val="both"/>
+      </w:pPr>
+      <w:r>
+        <w:rPr>
+          <w:rFonts w:ascii="Arial" w:cs="Arial" w:eastAsia="Arial" w:hAnsi="Arial"/>
+          <w:sz w:val="20"/>
+          <w:szCs w:val="20"/>
+        </w:rPr>
+        <w:t xml:space="preserve">a.  </w:t>
+      </w:r>
+      <w:r>
+        <w:rPr>
+          <w:rFonts w:ascii="Arial" w:cs="Arial" w:eastAsia="Arial" w:hAnsi="Arial"/>
+          <w:sz w:val="20"/>
+          <w:szCs w:val="20"/>
+        </w:rPr>
+        <w:t xml:space="preserve">Integrity rules in the database itself, so that they hold even outside the application: allowed values for severity, status and other fixed lists; unique reference numbers; foreign keys; triggers that refuse any change or deletion of the incident timeline, comments, messages and audit trail; a trigger that chains each audit entry to the previous one with SHA-256 (items 24, 25).</w:t>
+      </w:r>
+    </w:p>
+    <w:p>
+      <w:pPr>
+        <w:spacing w:before="0" w:after="80"/>
+        <w:ind w:left="400" w:hanging="400"/>
+        <w:jc w:val="both"/>
+      </w:pPr>
+      <w:r>
+        <w:rPr>
+          <w:rFonts w:ascii="Arial" w:cs="Arial" w:eastAsia="Arial" w:hAnsi="Arial"/>
+          <w:sz w:val="20"/>
+          <w:szCs w:val="20"/>
+        </w:rPr>
+        <w:t xml:space="preserve">b.  </w:t>
+      </w:r>
+      <w:r>
+        <w:rPr>
+          <w:rFonts w:ascii="Arial" w:cs="Arial" w:eastAsia="Arial" w:hAnsi="Arial"/>
+          <w:sz w:val="20"/>
+          <w:szCs w:val="20"/>
+        </w:rPr>
+        <w:t xml:space="preserve">Indexes for every common search and dashboard: incident status, sector, date and category, sector with status, filer with status, archive date, and status with time in status (overdue); history, comments and evidence by incident; audit trail by time, user and action; notifications by user and read state; messages by conversation; calls by participant and time; flash alerts by status and validity. Every list is paged, so response time does not grow with the size of the register (items 37, 39).</w:t>
+      </w:r>
+    </w:p>
+    <w:p>
+      <w:pPr>
+        <w:spacing w:before="0" w:after="80"/>
+        <w:ind w:left="400" w:hanging="400"/>
+        <w:jc w:val="both"/>
+      </w:pPr>
+      <w:r>
+        <w:rPr>
+          <w:rFonts w:ascii="Arial" w:cs="Arial" w:eastAsia="Arial" w:hAnsi="Arial"/>
+          <w:sz w:val="20"/>
+          <w:szCs w:val="20"/>
+        </w:rPr>
+        <w:t xml:space="preserve">c.  </w:t>
+      </w:r>
+      <w:r>
+        <w:rPr>
+          <w:rFonts w:ascii="Arial" w:cs="Arial" w:eastAsia="Arial" w:hAnsi="Arial"/>
+          <w:sz w:val="20"/>
+          <w:szCs w:val="20"/>
+        </w:rPr>
+        <w:t xml:space="preserve">Evidence and other files are kept in file storage, not in the database; the database holds their name, type, size, fingerprint and metadata. This keeps the database small and its backups fast (items 33, 34).</w:t>
+      </w:r>
+    </w:p>
+    <w:p>
+      <w:pPr>
+        <w:keepNext/>
+        <w:spacing w:before="120" w:after="60"/>
+        <w:jc w:val="center"/>
+      </w:pPr>
+      <w:r>
+        <w:drawing>
+          <wp:inline distT="0" distB="0" distL="0" distR="0">
+            <wp:extent cx="6286500" cy="6562725"/>
+            <wp:effectExtent t="0" r="0" b="0" l="0"/>
+            <wp:docPr id="1" name="" descr="" title=""/>
+            <wp:cNvGraphicFramePr>
+              <a:graphicFrameLocks xmlns:a="http://schemas.openxmlformats.org/drawingml/2006/main" noChangeAspect="1"/>
+            </wp:cNvGraphicFramePr>
+            <a:graphic xmlns:a="http://schemas.openxmlformats.org/drawingml/2006/main">
+              <a:graphicData uri="http://schemas.openxmlformats.org/drawingml/2006/picture">
+                <pic:pic xmlns:pic="http://schemas.openxmlformats.org/drawingml/2006/picture">
+                  <pic:nvPicPr>
+                    <pic:cNvPr id="0" name="" descr=""/>
+                    <pic:cNvPicPr>
+                      <a:picLocks noChangeAspect="1" noChangeArrowheads="1"/>
+                    </pic:cNvPicPr>
+                  </pic:nvPicPr>
+                  <pic:blipFill>
+                    <a:blip r:embed="rId12" cstate="none"/>
+                    <a:srcRect/>
+                    <a:stretch>
+                      <a:fillRect/>
+                    </a:stretch>
+                  </pic:blipFill>
+                  <pic:spPr bwMode="auto">
+                    <a:xfrm>
+                      <a:off x="0" y="0"/>
+                      <a:ext cx="6286500" cy="6562725"/>
+                    </a:xfrm>
+                    <a:prstGeom prst="rect">
+                      <a:avLst/>
+                    </a:prstGeom>
+                  </pic:spPr>
+                </pic:pic>
+              </a:graphicData>
+            </a:graphic>
+          </wp:inline>
+        </w:drawing>
+      </w:r>
+    </w:p>
+    <w:p>
+      <w:pPr>
+        <w:spacing w:before="0" w:after="200"/>
+        <w:jc w:val="center"/>
+      </w:pPr>
+      <w:r>
+        <w:rPr>
+          <w:rFonts w:ascii="Arial" w:cs="Arial" w:eastAsia="Arial" w:hAnsi="Arial"/>
+          <w:b/>
+          <w:bCs/>
+          <w:sz w:val="18"/>
+          <w:szCs w:val="18"/>
+        </w:rPr>
+        <w:t xml:space="preserve">Figure 5. </w:t>
+      </w:r>
+      <w:r>
+        <w:rPr>
+          <w:rFonts w:ascii="Arial" w:cs="Arial" w:eastAsia="Arial" w:hAnsi="Arial"/>
+          <w:sz w:val="18"/>
+          <w:szCs w:val="18"/>
+        </w:rPr>
+        <w:t xml:space="preserve">Entity-relationship diagram (1 of 2): organisation, users, incidents, evidence, audit trail (item 30)</w:t>
+      </w:r>
+    </w:p>
+    <w:p>
+      <w:pPr>
+        <w:keepNext/>
+        <w:spacing w:before="120" w:after="60"/>
+        <w:jc w:val="center"/>
+      </w:pPr>
+      <w:r>
+        <w:drawing>
+          <wp:inline distT="0" distB="0" distL="0" distR="0">
+            <wp:extent cx="6286500" cy="4819650"/>
+            <wp:effectExtent t="0" r="0" b="0" l="0"/>
+            <wp:docPr id="1" name="" descr="" title=""/>
+            <wp:cNvGraphicFramePr>
+              <a:graphicFrameLocks xmlns:a="http://schemas.openxmlformats.org/drawingml/2006/main" noChangeAspect="1"/>
+            </wp:cNvGraphicFramePr>
+            <a:graphic xmlns:a="http://schemas.openxmlformats.org/drawingml/2006/main">
+              <a:graphicData uri="http://schemas.openxmlformats.org/drawingml/2006/picture">
+                <pic:pic xmlns:pic="http://schemas.openxmlformats.org/drawingml/2006/picture">
+                  <pic:nvPicPr>
+                    <pic:cNvPr id="0" name="" descr=""/>
+                    <pic:cNvPicPr>
+                      <a:picLocks noChangeAspect="1" noChangeArrowheads="1"/>
+                    </pic:cNvPicPr>
+                  </pic:nvPicPr>
+                  <pic:blipFill>
+                    <a:blip r:embed="rId13" cstate="none"/>
+                    <a:srcRect/>
+                    <a:stretch>
+                      <a:fillRect/>
+                    </a:stretch>
+                  </pic:blipFill>
+                  <pic:spPr bwMode="auto">
+                    <a:xfrm>
+                      <a:off x="0" y="0"/>
+                      <a:ext cx="6286500" cy="4819650"/>
+                    </a:xfrm>
+                    <a:prstGeom prst="rect">
+                      <a:avLst/>
+                    </a:prstGeom>
+                  </pic:spPr>
+                </pic:pic>
+              </a:graphicData>
+            </a:graphic>
+          </wp:inline>
+        </w:drawing>
+      </w:r>
+    </w:p>
+    <w:p>
+      <w:pPr>
+        <w:spacing w:before="0" w:after="200"/>
+        <w:jc w:val="center"/>
+      </w:pPr>
+      <w:r>
+        <w:rPr>
+          <w:rFonts w:ascii="Arial" w:cs="Arial" w:eastAsia="Arial" w:hAnsi="Arial"/>
+          <w:b/>
+          <w:bCs/>
+          <w:sz w:val="18"/>
+          <w:szCs w:val="18"/>
+        </w:rPr>
+        <w:t xml:space="preserve">Figure 6. </w:t>
+      </w:r>
+      <w:r>
+        <w:rPr>
+          <w:rFonts w:ascii="Arial" w:cs="Arial" w:eastAsia="Arial" w:hAnsi="Arial"/>
+          <w:sz w:val="18"/>
+          <w:szCs w:val="18"/>
+        </w:rPr>
+        <w:t xml:space="preserve">Entity-relationship diagram (2 of 2): messaging, voice calls and flash alerts (item 30)</w:t>
+      </w:r>
+    </w:p>
+    <w:p>
+      <w:pPr>
         <w:pStyle w:val="Heading1"/>
         <w:keepNext/>
         <w:spacing w:before="300" w:after="120"/>
@@ -4497,6 +7479,77 @@
           <w:szCs w:val="20"/>
         </w:rPr>
         <w:t xml:space="preserve"/>
+      </w:r>
+    </w:p>
+    <w:p>
+      <w:pPr>
+        <w:keepNext/>
+        <w:spacing w:before="120" w:after="60"/>
+        <w:jc w:val="center"/>
+      </w:pPr>
+      <w:r>
+        <w:drawing>
+          <wp:inline distT="0" distB="0" distL="0" distR="0">
+            <wp:extent cx="6286500" cy="3533775"/>
+            <wp:effectExtent t="0" r="0" b="0" l="0"/>
+            <wp:docPr id="1" name="" descr="" title=""/>
+            <wp:cNvGraphicFramePr>
+              <a:graphicFrameLocks xmlns:a="http://schemas.openxmlformats.org/drawingml/2006/main" noChangeAspect="1"/>
+            </wp:cNvGraphicFramePr>
+            <a:graphic xmlns:a="http://schemas.openxmlformats.org/drawingml/2006/main">
+              <a:graphicData uri="http://schemas.openxmlformats.org/drawingml/2006/picture">
+                <pic:pic xmlns:pic="http://schemas.openxmlformats.org/drawingml/2006/picture">
+                  <pic:nvPicPr>
+                    <pic:cNvPr id="0" name="" descr=""/>
+                    <pic:cNvPicPr>
+                      <a:picLocks noChangeAspect="1" noChangeArrowheads="1"/>
+                    </pic:cNvPicPr>
+                  </pic:nvPicPr>
+                  <pic:blipFill>
+                    <a:blip r:embed="rId14" cstate="none"/>
+                    <a:srcRect/>
+                    <a:stretch>
+                      <a:fillRect/>
+                    </a:stretch>
+                  </pic:blipFill>
+                  <pic:spPr bwMode="auto">
+                    <a:xfrm>
+                      <a:off x="0" y="0"/>
+                      <a:ext cx="6286500" cy="3533775"/>
+                    </a:xfrm>
+                    <a:prstGeom prst="rect">
+                      <a:avLst/>
+                    </a:prstGeom>
+                  </pic:spPr>
+                </pic:pic>
+              </a:graphicData>
+            </a:graphic>
+          </wp:inline>
+        </w:drawing>
+      </w:r>
+    </w:p>
+    <w:p>
+      <w:pPr>
+        <w:spacing w:before="0" w:after="200"/>
+        <w:jc w:val="center"/>
+      </w:pPr>
+      <w:r>
+        <w:rPr>
+          <w:rFonts w:ascii="Arial" w:cs="Arial" w:eastAsia="Arial" w:hAnsi="Arial"/>
+          <w:b/>
+          <w:bCs/>
+          <w:sz w:val="18"/>
+          <w:szCs w:val="18"/>
+        </w:rPr>
+        <w:t xml:space="preserve">Figure 7. </w:t>
+      </w:r>
+      <w:r>
+        <w:rPr>
+          <w:rFonts w:ascii="Arial" w:cs="Arial" w:eastAsia="Arial" w:hAnsi="Arial"/>
+          <w:sz w:val="18"/>
+          <w:szCs w:val="18"/>
+        </w:rPr>
+        <w:t xml:space="preserve">Security layers: every request passes each check in order; every outcome is audited (items 4, 24–29, 49)</w:t>
       </w:r>
     </w:p>
     <w:p>
@@ -6634,7 +9687,7 @@
                 <w:sz w:val="20"/>
                 <w:szCs w:val="20"/>
               </w:rPr>
-              <w:t xml:space="preserve">Supporting services (antivirus, offline maps, call relay, e-mail relay)</w:t>
+              <w:t xml:space="preserve">Supporting services (antivirus, call relay, e-mail relay)</w:t>
             </w:r>
           </w:p>
         </w:tc>
@@ -6696,7 +9749,7 @@
                 <w:sz w:val="20"/>
                 <w:szCs w:val="20"/>
               </w:rPr>
-              <w:t xml:space="preserve">4 vCPU, 8 GB RAM, 200 GB</w:t>
+              <w:t xml:space="preserve">4 vCPU, 8 GB RAM, 100 GB</w:t>
             </w:r>
           </w:p>
         </w:tc>
@@ -6727,7 +9780,7 @@
                 <w:sz w:val="20"/>
                 <w:szCs w:val="20"/>
               </w:rPr>
-              <w:t xml:space="preserve">2 vCPU, 6 GB RAM, 200 GB</w:t>
+              <w:t xml:space="preserve">2 vCPU, 6 GB RAM, 100 GB</w:t>
             </w:r>
           </w:p>
         </w:tc>
@@ -7842,7 +10895,7 @@
                 <w:sz w:val="20"/>
                 <w:szCs w:val="20"/>
               </w:rPr>
-              <w:t xml:space="preserve">Antivirus engine that checks every upload (item 49; about 3 GB RAM for its signature database); offline map tiles for Bangladesh so that the GIS map works on an isolated network (items 8, 18; about 200 GB of pre-rendered tiles to street level along the border); relay for voice calls across network segments (Annex B, section 3); e-mail relay if BGB has none. Light services, so one virtual machine.</w:t>
+              <w:t xml:space="preserve">Antivirus engine that checks every upload (item 49; about 3 GB RAM for its signature database); relay for voice calls across network segments (Annex B, section 3); e-mail relay if BGB has none. Light services, so one virtual machine.</w:t>
             </w:r>
           </w:p>
         </w:tc>
@@ -7873,7 +10926,7 @@
                 <w:sz w:val="20"/>
                 <w:szCs w:val="20"/>
               </w:rPr>
-              <w:t xml:space="preserve">Not duplicated: a fault affects maps, calls or e-mail for its duration; incident recording, review and reporting continue.</w:t>
+              <w:t xml:space="preserve">Not duplicated: a fault affects upload scanning, calls or e-mail for its duration; incident recording, review and reporting continue.</w:t>
             </w:r>
           </w:p>
         </w:tc>
@@ -8029,7 +11082,7 @@
           <w:sz w:val="20"/>
           <w:szCs w:val="20"/>
         </w:rPr>
-        <w:t xml:space="preserve">Map display (items 8 and 18): the demo loads map tiles from the internet. On an isolated BGB network an offline tile server with map data for Bangladesh is installed on the supporting-services server.</w:t>
+        <w:t xml:space="preserve">Map display (items 8 and 18): BIRDS needs no internet and no separate map server for its maps. The application servers hold one file with the vector map of Bangladesh and the border strip (OpenStreetMap data, about 340 MB, street level), and the browser draws the map from it, with place names in English or Bangla. The demonstration runs the same way, without internet. Newer map data is installed by replacing the file (one command, on any computer with internet).</w:t>
       </w:r>
     </w:p>
     <w:p>
@@ -8460,6 +11513,77 @@
           <w:szCs w:val="20"/>
         </w:rPr>
         <w:t xml:space="preserve"/>
+      </w:r>
+    </w:p>
+    <w:p>
+      <w:pPr>
+        <w:keepNext/>
+        <w:spacing w:before="120" w:after="60"/>
+        <w:jc w:val="center"/>
+      </w:pPr>
+      <w:r>
+        <w:drawing>
+          <wp:inline distT="0" distB="0" distL="0" distR="0">
+            <wp:extent cx="6286500" cy="4095750"/>
+            <wp:effectExtent t="0" r="0" b="0" l="0"/>
+            <wp:docPr id="1" name="" descr="" title=""/>
+            <wp:cNvGraphicFramePr>
+              <a:graphicFrameLocks xmlns:a="http://schemas.openxmlformats.org/drawingml/2006/main" noChangeAspect="1"/>
+            </wp:cNvGraphicFramePr>
+            <a:graphic xmlns:a="http://schemas.openxmlformats.org/drawingml/2006/main">
+              <a:graphicData uri="http://schemas.openxmlformats.org/drawingml/2006/picture">
+                <pic:pic xmlns:pic="http://schemas.openxmlformats.org/drawingml/2006/picture">
+                  <pic:nvPicPr>
+                    <pic:cNvPr id="0" name="" descr=""/>
+                    <pic:cNvPicPr>
+                      <a:picLocks noChangeAspect="1" noChangeArrowheads="1"/>
+                    </pic:cNvPicPr>
+                  </pic:nvPicPr>
+                  <pic:blipFill>
+                    <a:blip r:embed="rId15" cstate="none"/>
+                    <a:srcRect/>
+                    <a:stretch>
+                      <a:fillRect/>
+                    </a:stretch>
+                  </pic:blipFill>
+                  <pic:spPr bwMode="auto">
+                    <a:xfrm>
+                      <a:off x="0" y="0"/>
+                      <a:ext cx="6286500" cy="4095750"/>
+                    </a:xfrm>
+                    <a:prstGeom prst="rect">
+                      <a:avLst/>
+                    </a:prstGeom>
+                  </pic:spPr>
+                </pic:pic>
+              </a:graphicData>
+            </a:graphic>
+          </wp:inline>
+        </w:drawing>
+      </w:r>
+    </w:p>
+    <w:p>
+      <w:pPr>
+        <w:spacing w:before="0" w:after="200"/>
+        <w:jc w:val="center"/>
+      </w:pPr>
+      <w:r>
+        <w:rPr>
+          <w:rFonts w:ascii="Arial" w:cs="Arial" w:eastAsia="Arial" w:hAnsi="Arial"/>
+          <w:b/>
+          <w:bCs/>
+          <w:sz w:val="18"/>
+          <w:szCs w:val="18"/>
+        </w:rPr>
+        <w:t xml:space="preserve">Figure 8. </w:t>
+      </w:r>
+      <w:r>
+        <w:rPr>
+          <w:rFonts w:ascii="Arial" w:cs="Arial" w:eastAsia="Arial" w:hAnsi="Arial"/>
+          <w:sz w:val="18"/>
+          <w:szCs w:val="18"/>
+        </w:rPr>
+        <w:t xml:space="preserve">Backup, replication and disaster recovery, set up during implementation (items 34, 35, 36)</w:t>
       </w:r>
     </w:p>
     <w:p>
@@ -9253,7 +12377,7 @@
                 <w:sz w:val="20"/>
                 <w:szCs w:val="20"/>
               </w:rPr>
-              <w:t xml:space="preserve">Directory (AD/LDAP), SMTP relay, antivirus engine, map-tile server</w:t>
+              <w:t xml:space="preserve">Directory (AD/LDAP), SMTP relay, antivirus engine, current offline map data</w:t>
             </w:r>
           </w:p>
         </w:tc>
@@ -9946,6 +13070,77 @@
           <w:szCs w:val="20"/>
         </w:rPr>
         <w:t xml:space="preserve"/>
+      </w:r>
+    </w:p>
+    <w:p>
+      <w:pPr>
+        <w:keepNext/>
+        <w:spacing w:before="120" w:after="60"/>
+        <w:jc w:val="center"/>
+      </w:pPr>
+      <w:r>
+        <w:drawing>
+          <wp:inline distT="0" distB="0" distL="0" distR="0">
+            <wp:extent cx="6286500" cy="3067050"/>
+            <wp:effectExtent t="0" r="0" b="0" l="0"/>
+            <wp:docPr id="1" name="" descr="" title=""/>
+            <wp:cNvGraphicFramePr>
+              <a:graphicFrameLocks xmlns:a="http://schemas.openxmlformats.org/drawingml/2006/main" noChangeAspect="1"/>
+            </wp:cNvGraphicFramePr>
+            <a:graphic xmlns:a="http://schemas.openxmlformats.org/drawingml/2006/main">
+              <a:graphicData uri="http://schemas.openxmlformats.org/drawingml/2006/picture">
+                <pic:pic xmlns:pic="http://schemas.openxmlformats.org/drawingml/2006/picture">
+                  <pic:nvPicPr>
+                    <pic:cNvPr id="0" name="" descr=""/>
+                    <pic:cNvPicPr>
+                      <a:picLocks noChangeAspect="1" noChangeArrowheads="1"/>
+                    </pic:cNvPicPr>
+                  </pic:nvPicPr>
+                  <pic:blipFill>
+                    <a:blip r:embed="rId16" cstate="none"/>
+                    <a:srcRect/>
+                    <a:stretch>
+                      <a:fillRect/>
+                    </a:stretch>
+                  </pic:blipFill>
+                  <pic:spPr bwMode="auto">
+                    <a:xfrm>
+                      <a:off x="0" y="0"/>
+                      <a:ext cx="6286500" cy="3067050"/>
+                    </a:xfrm>
+                    <a:prstGeom prst="rect">
+                      <a:avLst/>
+                    </a:prstGeom>
+                  </pic:spPr>
+                </pic:pic>
+              </a:graphicData>
+            </a:graphic>
+          </wp:inline>
+        </w:drawing>
+      </w:r>
+    </w:p>
+    <w:p>
+      <w:pPr>
+        <w:spacing w:before="0" w:after="200"/>
+        <w:jc w:val="center"/>
+      </w:pPr>
+      <w:r>
+        <w:rPr>
+          <w:rFonts w:ascii="Arial" w:cs="Arial" w:eastAsia="Arial" w:hAnsi="Arial"/>
+          <w:b/>
+          <w:bCs/>
+          <w:sz w:val="18"/>
+          <w:szCs w:val="18"/>
+        </w:rPr>
+        <w:t xml:space="preserve">Figure 9. </w:t>
+      </w:r>
+      <w:r>
+        <w:rPr>
+          <w:rFonts w:ascii="Arial" w:cs="Arial" w:eastAsia="Arial" w:hAnsi="Arial"/>
+          <w:sz w:val="18"/>
+          <w:szCs w:val="18"/>
+        </w:rPr>
+        <w:t xml:space="preserve">Indicative work plan (item 56)</w:t>
       </w:r>
     </w:p>
     <w:p>

</xml_diff>